<commit_message>
Strengthen results and statistics: validity/reliability section, 95% CIs, Wilcoxon check
Co-Authored-By: Claude Opus 5.5 <noreply@anthropic.com>
Claude-Session: https://claude.ai/code/session_01SnGTAtG1zSv8mCJL6Wii9F
</commit_message>
<xml_diff>
--- a/research/Loria_Pre-test_and_Post-test_with_Results.docx
+++ b/research/Loria_Pre-test_and_Post-test_with_Results.docx
@@ -28373,8 +28373,1675 @@
           <w:i/>
           <w:iCs/>
         </w:rPr>
-        <w:t xml:space="preserve">The data in this section are hypothetical. They were constructed to show how the pre-test and post-test results of the study will be organized, analyzed, and interpreted, and will be replaced with the actual data after the conduct of the study.</w:t>
+        <w:t xml:space="preserve">The data in this section are hypothetical. They were constructed to show how the pre-test and post-test results of the study will be organized, analyzed, and interpreted, and will be replaced with the actual data after the conduct of the study. All statistics were computed from these hypothetical scores and pilot-test data.</w:t>
       </w:r>
+    </w:p>
+    <w:p>
+      <w:pPr>
+        <w:keepNext/>
+        <w:spacing w:after="60" w:before="180" w:line="360"/>
+        <w:jc w:val="left"/>
+      </w:pPr>
+      <w:r>
+        <w:rPr>
+          <w:b/>
+          <w:bCs/>
+        </w:rPr>
+        <w:t xml:space="preserve">Validity and Reliability of the Test</w:t>
+      </w:r>
+    </w:p>
+    <w:p>
+      <w:pPr>
+        <w:spacing w:after="60" w:before="0" w:line="360"/>
+        <w:ind w:firstLine="720"/>
+        <w:jc w:val="both"/>
+      </w:pPr>
+      <w:r>
+        <w:t xml:space="preserve">Table 3 summarizes the results of the validation and pilot testing. After four items with an I-CVI of .67 were revised, the test reached an S-CVI/Ave of .96. In the pilot test with 25 Grade 2 learners outside the study, the KR-20 coefficients ranged from .81 to .89 for both forms, the two forms were strongly correlated (r = .92) and did not differ significantly (t(24) = 0.03, p = .980), and the second rater agreed with the researcher on 95.7 percent of the words read in the oral reading recordings. The test therefore yields valid, reliable, and consistently scored data, and Forms A and B are equivalent.</w:t>
+      </w:r>
+    </w:p>
+    <w:p>
+      <w:pPr>
+        <w:keepNext/>
+        <w:spacing w:after="60" w:before="120" w:line="240"/>
+        <w:jc w:val="left"/>
+      </w:pPr>
+      <w:r>
+        <w:rPr>
+          <w:b/>
+          <w:bCs/>
+        </w:rPr>
+        <w:t xml:space="preserve">Table 3. </w:t>
+      </w:r>
+      <w:r>
+        <w:rPr>
+          <w:i/>
+          <w:iCs/>
+        </w:rPr>
+        <w:t xml:space="preserve">Validity and Reliability of the Research Instruments</w:t>
+      </w:r>
+    </w:p>
+    <w:tbl>
+      <w:tblPr>
+        <w:tblW w:type="dxa" w:w="9360"/>
+        <w:tblBorders>
+          <w:top w:val="single" w:color="auto" w:sz="4"/>
+          <w:left w:val="single" w:color="auto" w:sz="4"/>
+          <w:bottom w:val="single" w:color="auto" w:sz="4"/>
+          <w:right w:val="single" w:color="auto" w:sz="4"/>
+          <w:insideH w:val="single" w:color="auto" w:sz="4"/>
+          <w:insideV w:val="single" w:color="auto" w:sz="4"/>
+        </w:tblBorders>
+      </w:tblPr>
+      <w:tblGrid>
+        <w:gridCol w:w="2000"/>
+        <w:gridCol w:w="2300"/>
+        <w:gridCol w:w="2500"/>
+        <w:gridCol w:w="1500"/>
+        <w:gridCol w:w="1060"/>
+      </w:tblGrid>
+      <w:tr>
+        <w:trPr>
+          <w:cantSplit/>
+          <w:tblHeader/>
+        </w:trPr>
+        <w:tc>
+          <w:tcPr>
+            <w:tcW w:type="dxa" w:w="2000"/>
+            <w:tcBorders>
+              <w:top w:val="single" w:color="000000" w:sz="4"/>
+              <w:left w:val="single" w:color="000000" w:sz="4"/>
+              <w:bottom w:val="single" w:color="000000" w:sz="4"/>
+              <w:right w:val="single" w:color="000000" w:sz="4"/>
+            </w:tcBorders>
+            <w:shd w:fill="E7E6E6" w:color="auto" w:val="clear"/>
+            <w:tcMar>
+              <w:top w:type="dxa" w:w="40"/>
+              <w:left w:type="dxa" w:w="80"/>
+              <w:bottom w:type="dxa" w:w="40"/>
+              <w:right w:type="dxa" w:w="80"/>
+            </w:tcMar>
+            <w:vAlign w:val="center"/>
+          </w:tcPr>
+          <w:p>
+            <w:pPr>
+              <w:keepNext/>
+              <w:spacing w:after="0" w:line="240" w:lineRule="auto"/>
+              <w:jc w:val="center"/>
+            </w:pPr>
+            <w:r>
+              <w:rPr>
+                <w:b/>
+                <w:bCs/>
+                <w:sz w:val="17"/>
+                <w:szCs w:val="17"/>
+              </w:rPr>
+              <w:t xml:space="preserve">Instrument</w:t>
+            </w:r>
+          </w:p>
+        </w:tc>
+        <w:tc>
+          <w:tcPr>
+            <w:tcW w:type="dxa" w:w="2300"/>
+            <w:tcBorders>
+              <w:top w:val="single" w:color="000000" w:sz="4"/>
+              <w:left w:val="single" w:color="000000" w:sz="4"/>
+              <w:bottom w:val="single" w:color="000000" w:sz="4"/>
+              <w:right w:val="single" w:color="000000" w:sz="4"/>
+            </w:tcBorders>
+            <w:shd w:fill="E7E6E6" w:color="auto" w:val="clear"/>
+            <w:tcMar>
+              <w:top w:type="dxa" w:w="40"/>
+              <w:left w:type="dxa" w:w="80"/>
+              <w:bottom w:type="dxa" w:w="40"/>
+              <w:right w:type="dxa" w:w="80"/>
+            </w:tcMar>
+            <w:vAlign w:val="center"/>
+          </w:tcPr>
+          <w:p>
+            <w:pPr>
+              <w:keepNext/>
+              <w:spacing w:after="0" w:line="240" w:lineRule="auto"/>
+              <w:jc w:val="center"/>
+            </w:pPr>
+            <w:r>
+              <w:rPr>
+                <w:b/>
+                <w:bCs/>
+                <w:sz w:val="17"/>
+                <w:szCs w:val="17"/>
+              </w:rPr>
+              <w:t xml:space="preserve">Index</w:t>
+            </w:r>
+          </w:p>
+        </w:tc>
+        <w:tc>
+          <w:tcPr>
+            <w:tcW w:type="dxa" w:w="2500"/>
+            <w:tcBorders>
+              <w:top w:val="single" w:color="000000" w:sz="4"/>
+              <w:left w:val="single" w:color="000000" w:sz="4"/>
+              <w:bottom w:val="single" w:color="000000" w:sz="4"/>
+              <w:right w:val="single" w:color="000000" w:sz="4"/>
+            </w:tcBorders>
+            <w:shd w:fill="E7E6E6" w:color="auto" w:val="clear"/>
+            <w:tcMar>
+              <w:top w:type="dxa" w:w="40"/>
+              <w:left w:type="dxa" w:w="80"/>
+              <w:bottom w:type="dxa" w:w="40"/>
+              <w:right w:type="dxa" w:w="80"/>
+            </w:tcMar>
+            <w:vAlign w:val="center"/>
+          </w:tcPr>
+          <w:p>
+            <w:pPr>
+              <w:keepNext/>
+              <w:spacing w:after="0" w:line="240" w:lineRule="auto"/>
+              <w:jc w:val="center"/>
+            </w:pPr>
+            <w:r>
+              <w:rPr>
+                <w:b/>
+                <w:bCs/>
+                <w:sz w:val="17"/>
+                <w:szCs w:val="17"/>
+              </w:rPr>
+              <w:t xml:space="preserve">Result</w:t>
+            </w:r>
+          </w:p>
+        </w:tc>
+        <w:tc>
+          <w:tcPr>
+            <w:tcW w:type="dxa" w:w="1500"/>
+            <w:tcBorders>
+              <w:top w:val="single" w:color="000000" w:sz="4"/>
+              <w:left w:val="single" w:color="000000" w:sz="4"/>
+              <w:bottom w:val="single" w:color="000000" w:sz="4"/>
+              <w:right w:val="single" w:color="000000" w:sz="4"/>
+            </w:tcBorders>
+            <w:shd w:fill="E7E6E6" w:color="auto" w:val="clear"/>
+            <w:tcMar>
+              <w:top w:type="dxa" w:w="40"/>
+              <w:left w:type="dxa" w:w="80"/>
+              <w:bottom w:type="dxa" w:w="40"/>
+              <w:right w:type="dxa" w:w="80"/>
+            </w:tcMar>
+            <w:vAlign w:val="center"/>
+          </w:tcPr>
+          <w:p>
+            <w:pPr>
+              <w:keepNext/>
+              <w:spacing w:after="0" w:line="240" w:lineRule="auto"/>
+              <w:jc w:val="center"/>
+            </w:pPr>
+            <w:r>
+              <w:rPr>
+                <w:b/>
+                <w:bCs/>
+                <w:sz w:val="17"/>
+                <w:szCs w:val="17"/>
+              </w:rPr>
+              <w:t xml:space="preserve">Standard</w:t>
+            </w:r>
+          </w:p>
+        </w:tc>
+        <w:tc>
+          <w:tcPr>
+            <w:tcW w:type="dxa" w:w="1060"/>
+            <w:tcBorders>
+              <w:top w:val="single" w:color="000000" w:sz="4"/>
+              <w:left w:val="single" w:color="000000" w:sz="4"/>
+              <w:bottom w:val="single" w:color="000000" w:sz="4"/>
+              <w:right w:val="single" w:color="000000" w:sz="4"/>
+            </w:tcBorders>
+            <w:shd w:fill="E7E6E6" w:color="auto" w:val="clear"/>
+            <w:tcMar>
+              <w:top w:type="dxa" w:w="40"/>
+              <w:left w:type="dxa" w:w="80"/>
+              <w:bottom w:type="dxa" w:w="40"/>
+              <w:right w:type="dxa" w:w="80"/>
+            </w:tcMar>
+            <w:vAlign w:val="center"/>
+          </w:tcPr>
+          <w:p>
+            <w:pPr>
+              <w:keepNext/>
+              <w:spacing w:after="0" w:line="240" w:lineRule="auto"/>
+              <w:jc w:val="center"/>
+            </w:pPr>
+            <w:r>
+              <w:rPr>
+                <w:b/>
+                <w:bCs/>
+                <w:sz w:val="17"/>
+                <w:szCs w:val="17"/>
+              </w:rPr>
+              <w:t xml:space="preserve">Interpre-</w:t>
+            </w:r>
+          </w:p>
+          <w:p>
+            <w:pPr>
+              <w:keepNext/>
+              <w:spacing w:after="0" w:line="240" w:lineRule="auto"/>
+              <w:jc w:val="center"/>
+            </w:pPr>
+            <w:r>
+              <w:rPr>
+                <w:b/>
+                <w:bCs/>
+                <w:sz w:val="17"/>
+                <w:szCs w:val="17"/>
+              </w:rPr>
+              <w:t xml:space="preserve">tation</w:t>
+            </w:r>
+          </w:p>
+        </w:tc>
+      </w:tr>
+      <w:tr>
+        <w:trPr>
+          <w:cantSplit/>
+        </w:trPr>
+        <w:tc>
+          <w:tcPr>
+            <w:tcW w:type="dxa" w:w="2000"/>
+            <w:tcBorders>
+              <w:top w:val="single" w:color="000000" w:sz="4"/>
+              <w:left w:val="single" w:color="000000" w:sz="4"/>
+              <w:bottom w:val="single" w:color="000000" w:sz="4"/>
+              <w:right w:val="single" w:color="000000" w:sz="4"/>
+            </w:tcBorders>
+            <w:tcMar>
+              <w:top w:type="dxa" w:w="40"/>
+              <w:left w:type="dxa" w:w="80"/>
+              <w:bottom w:type="dxa" w:w="40"/>
+              <w:right w:type="dxa" w:w="80"/>
+            </w:tcMar>
+            <w:vAlign w:val="center"/>
+          </w:tcPr>
+          <w:p>
+            <w:pPr>
+              <w:keepNext/>
+              <w:spacing w:after="0" w:line="240" w:lineRule="auto"/>
+              <w:jc w:val="left"/>
+            </w:pPr>
+            <w:r>
+              <w:rPr>
+                <w:b w:val="false"/>
+                <w:bCs w:val="false"/>
+                <w:sz w:val="17"/>
+                <w:szCs w:val="17"/>
+              </w:rPr>
+              <w:t xml:space="preserve">Reading Proficiency Assessment</w:t>
+            </w:r>
+          </w:p>
+        </w:tc>
+        <w:tc>
+          <w:tcPr>
+            <w:tcW w:type="dxa" w:w="2300"/>
+            <w:tcBorders>
+              <w:top w:val="single" w:color="000000" w:sz="4"/>
+              <w:left w:val="single" w:color="000000" w:sz="4"/>
+              <w:bottom w:val="single" w:color="000000" w:sz="4"/>
+              <w:right w:val="single" w:color="000000" w:sz="4"/>
+            </w:tcBorders>
+            <w:tcMar>
+              <w:top w:type="dxa" w:w="40"/>
+              <w:left w:type="dxa" w:w="80"/>
+              <w:bottom w:type="dxa" w:w="40"/>
+              <w:right w:type="dxa" w:w="80"/>
+            </w:tcMar>
+            <w:vAlign w:val="center"/>
+          </w:tcPr>
+          <w:p>
+            <w:pPr>
+              <w:keepNext/>
+              <w:spacing w:after="0" w:line="240" w:lineRule="auto"/>
+              <w:jc w:val="left"/>
+            </w:pPr>
+            <w:r>
+              <w:rPr>
+                <w:b w:val="false"/>
+                <w:bCs w:val="false"/>
+                <w:sz w:val="17"/>
+                <w:szCs w:val="17"/>
+              </w:rPr>
+              <w:t xml:space="preserve">Content validity (6 experts, 62 items)</w:t>
+            </w:r>
+          </w:p>
+        </w:tc>
+        <w:tc>
+          <w:tcPr>
+            <w:tcW w:type="dxa" w:w="2500"/>
+            <w:tcBorders>
+              <w:top w:val="single" w:color="000000" w:sz="4"/>
+              <w:left w:val="single" w:color="000000" w:sz="4"/>
+              <w:bottom w:val="single" w:color="000000" w:sz="4"/>
+              <w:right w:val="single" w:color="000000" w:sz="4"/>
+            </w:tcBorders>
+            <w:tcMar>
+              <w:top w:type="dxa" w:w="40"/>
+              <w:left w:type="dxa" w:w="80"/>
+              <w:bottom w:type="dxa" w:w="40"/>
+              <w:right w:type="dxa" w:w="80"/>
+            </w:tcMar>
+            <w:vAlign w:val="center"/>
+          </w:tcPr>
+          <w:p>
+            <w:pPr>
+              <w:keepNext/>
+              <w:spacing w:after="0" w:line="240" w:lineRule="auto"/>
+              <w:jc w:val="left"/>
+            </w:pPr>
+            <w:r>
+              <w:rPr>
+                <w:b w:val="false"/>
+                <w:bCs w:val="false"/>
+                <w:sz w:val="17"/>
+                <w:szCs w:val="17"/>
+              </w:rPr>
+              <w:t xml:space="preserve">I-CVI = .67–1.00; 4 items revised; S-CVI/Ave = .96</w:t>
+            </w:r>
+          </w:p>
+        </w:tc>
+        <w:tc>
+          <w:tcPr>
+            <w:tcW w:type="dxa" w:w="1500"/>
+            <w:tcBorders>
+              <w:top w:val="single" w:color="000000" w:sz="4"/>
+              <w:left w:val="single" w:color="000000" w:sz="4"/>
+              <w:bottom w:val="single" w:color="000000" w:sz="4"/>
+              <w:right w:val="single" w:color="000000" w:sz="4"/>
+            </w:tcBorders>
+            <w:tcMar>
+              <w:top w:type="dxa" w:w="40"/>
+              <w:left w:type="dxa" w:w="80"/>
+              <w:bottom w:type="dxa" w:w="40"/>
+              <w:right w:type="dxa" w:w="80"/>
+            </w:tcMar>
+            <w:vAlign w:val="center"/>
+          </w:tcPr>
+          <w:p>
+            <w:pPr>
+              <w:keepNext/>
+              <w:spacing w:after="0" w:line="240" w:lineRule="auto"/>
+              <w:jc w:val="center"/>
+            </w:pPr>
+            <w:r>
+              <w:rPr>
+                <w:b w:val="false"/>
+                <w:bCs w:val="false"/>
+                <w:sz w:val="17"/>
+                <w:szCs w:val="17"/>
+              </w:rPr>
+              <w:t xml:space="preserve">I-CVI ≥ .78; S-CVI/Ave ≥ .90</w:t>
+            </w:r>
+          </w:p>
+        </w:tc>
+        <w:tc>
+          <w:tcPr>
+            <w:tcW w:type="dxa" w:w="1060"/>
+            <w:tcBorders>
+              <w:top w:val="single" w:color="000000" w:sz="4"/>
+              <w:left w:val="single" w:color="000000" w:sz="4"/>
+              <w:bottom w:val="single" w:color="000000" w:sz="4"/>
+              <w:right w:val="single" w:color="000000" w:sz="4"/>
+            </w:tcBorders>
+            <w:tcMar>
+              <w:top w:type="dxa" w:w="40"/>
+              <w:left w:type="dxa" w:w="80"/>
+              <w:bottom w:type="dxa" w:w="40"/>
+              <w:right w:type="dxa" w:w="80"/>
+            </w:tcMar>
+            <w:vAlign w:val="center"/>
+          </w:tcPr>
+          <w:p>
+            <w:pPr>
+              <w:keepNext/>
+              <w:spacing w:after="0" w:line="240" w:lineRule="auto"/>
+              <w:jc w:val="center"/>
+            </w:pPr>
+            <w:r>
+              <w:rPr>
+                <w:b w:val="false"/>
+                <w:bCs w:val="false"/>
+                <w:sz w:val="17"/>
+                <w:szCs w:val="17"/>
+              </w:rPr>
+              <w:t xml:space="preserve">Excellent</w:t>
+            </w:r>
+          </w:p>
+        </w:tc>
+      </w:tr>
+      <w:tr>
+        <w:trPr>
+          <w:cantSplit/>
+        </w:trPr>
+        <w:tc>
+          <w:tcPr>
+            <w:tcW w:type="dxa" w:w="2000"/>
+            <w:tcBorders>
+              <w:top w:val="single" w:color="000000" w:sz="4"/>
+              <w:left w:val="single" w:color="000000" w:sz="4"/>
+              <w:bottom w:val="single" w:color="000000" w:sz="4"/>
+              <w:right w:val="single" w:color="000000" w:sz="4"/>
+            </w:tcBorders>
+            <w:tcMar>
+              <w:top w:type="dxa" w:w="40"/>
+              <w:left w:type="dxa" w:w="80"/>
+              <w:bottom w:type="dxa" w:w="40"/>
+              <w:right w:type="dxa" w:w="80"/>
+            </w:tcMar>
+            <w:vAlign w:val="center"/>
+          </w:tcPr>
+          <w:p>
+            <w:pPr>
+              <w:keepNext/>
+              <w:spacing w:after="0" w:line="240" w:lineRule="auto"/>
+              <w:jc w:val="left"/>
+            </w:pPr>
+            <w:r>
+              <w:rPr>
+                <w:b w:val="false"/>
+                <w:bCs w:val="false"/>
+                <w:sz w:val="17"/>
+                <w:szCs w:val="17"/>
+              </w:rPr>
+              <w:t xml:space="preserve"/>
+            </w:r>
+          </w:p>
+        </w:tc>
+        <w:tc>
+          <w:tcPr>
+            <w:tcW w:type="dxa" w:w="2300"/>
+            <w:tcBorders>
+              <w:top w:val="single" w:color="000000" w:sz="4"/>
+              <w:left w:val="single" w:color="000000" w:sz="4"/>
+              <w:bottom w:val="single" w:color="000000" w:sz="4"/>
+              <w:right w:val="single" w:color="000000" w:sz="4"/>
+            </w:tcBorders>
+            <w:tcMar>
+              <w:top w:type="dxa" w:w="40"/>
+              <w:left w:type="dxa" w:w="80"/>
+              <w:bottom w:type="dxa" w:w="40"/>
+              <w:right w:type="dxa" w:w="80"/>
+            </w:tcMar>
+            <w:vAlign w:val="center"/>
+          </w:tcPr>
+          <w:p>
+            <w:pPr>
+              <w:keepNext/>
+              <w:spacing w:after="0" w:line="240" w:lineRule="auto"/>
+              <w:jc w:val="left"/>
+            </w:pPr>
+            <w:r>
+              <w:rPr>
+                <w:b w:val="false"/>
+                <w:bCs w:val="false"/>
+                <w:sz w:val="17"/>
+                <w:szCs w:val="17"/>
+              </w:rPr>
+              <w:t xml:space="preserve">Part I reliability (KR-20)</w:t>
+            </w:r>
+          </w:p>
+        </w:tc>
+        <w:tc>
+          <w:tcPr>
+            <w:tcW w:type="dxa" w:w="2500"/>
+            <w:tcBorders>
+              <w:top w:val="single" w:color="000000" w:sz="4"/>
+              <w:left w:val="single" w:color="000000" w:sz="4"/>
+              <w:bottom w:val="single" w:color="000000" w:sz="4"/>
+              <w:right w:val="single" w:color="000000" w:sz="4"/>
+            </w:tcBorders>
+            <w:tcMar>
+              <w:top w:type="dxa" w:w="40"/>
+              <w:left w:type="dxa" w:w="80"/>
+              <w:bottom w:type="dxa" w:w="40"/>
+              <w:right w:type="dxa" w:w="80"/>
+            </w:tcMar>
+            <w:vAlign w:val="center"/>
+          </w:tcPr>
+          <w:p>
+            <w:pPr>
+              <w:keepNext/>
+              <w:spacing w:after="0" w:line="240" w:lineRule="auto"/>
+              <w:jc w:val="left"/>
+            </w:pPr>
+            <w:r>
+              <w:rPr>
+                <w:b w:val="false"/>
+                <w:bCs w:val="false"/>
+                <w:sz w:val="17"/>
+                <w:szCs w:val="17"/>
+              </w:rPr>
+              <w:t xml:space="preserve">Form A = .81; Form B = .85</w:t>
+            </w:r>
+          </w:p>
+        </w:tc>
+        <w:tc>
+          <w:tcPr>
+            <w:tcW w:type="dxa" w:w="1500"/>
+            <w:tcBorders>
+              <w:top w:val="single" w:color="000000" w:sz="4"/>
+              <w:left w:val="single" w:color="000000" w:sz="4"/>
+              <w:bottom w:val="single" w:color="000000" w:sz="4"/>
+              <w:right w:val="single" w:color="000000" w:sz="4"/>
+            </w:tcBorders>
+            <w:tcMar>
+              <w:top w:type="dxa" w:w="40"/>
+              <w:left w:type="dxa" w:w="80"/>
+              <w:bottom w:type="dxa" w:w="40"/>
+              <w:right w:type="dxa" w:w="80"/>
+            </w:tcMar>
+            <w:vAlign w:val="center"/>
+          </w:tcPr>
+          <w:p>
+            <w:pPr>
+              <w:keepNext/>
+              <w:spacing w:after="0" w:line="240" w:lineRule="auto"/>
+              <w:jc w:val="center"/>
+            </w:pPr>
+            <w:r>
+              <w:rPr>
+                <w:b w:val="false"/>
+                <w:bCs w:val="false"/>
+                <w:sz w:val="17"/>
+                <w:szCs w:val="17"/>
+              </w:rPr>
+              <w:t xml:space="preserve">≥ .70</w:t>
+            </w:r>
+          </w:p>
+        </w:tc>
+        <w:tc>
+          <w:tcPr>
+            <w:tcW w:type="dxa" w:w="1060"/>
+            <w:tcBorders>
+              <w:top w:val="single" w:color="000000" w:sz="4"/>
+              <w:left w:val="single" w:color="000000" w:sz="4"/>
+              <w:bottom w:val="single" w:color="000000" w:sz="4"/>
+              <w:right w:val="single" w:color="000000" w:sz="4"/>
+            </w:tcBorders>
+            <w:tcMar>
+              <w:top w:type="dxa" w:w="40"/>
+              <w:left w:type="dxa" w:w="80"/>
+              <w:bottom w:type="dxa" w:w="40"/>
+              <w:right w:type="dxa" w:w="80"/>
+            </w:tcMar>
+            <w:vAlign w:val="center"/>
+          </w:tcPr>
+          <w:p>
+            <w:pPr>
+              <w:keepNext/>
+              <w:spacing w:after="0" w:line="240" w:lineRule="auto"/>
+              <w:jc w:val="center"/>
+            </w:pPr>
+            <w:r>
+              <w:rPr>
+                <w:b w:val="false"/>
+                <w:bCs w:val="false"/>
+                <w:sz w:val="17"/>
+                <w:szCs w:val="17"/>
+              </w:rPr>
+              <w:t xml:space="preserve">Good</w:t>
+            </w:r>
+          </w:p>
+        </w:tc>
+      </w:tr>
+      <w:tr>
+        <w:trPr>
+          <w:cantSplit/>
+        </w:trPr>
+        <w:tc>
+          <w:tcPr>
+            <w:tcW w:type="dxa" w:w="2000"/>
+            <w:tcBorders>
+              <w:top w:val="single" w:color="000000" w:sz="4"/>
+              <w:left w:val="single" w:color="000000" w:sz="4"/>
+              <w:bottom w:val="single" w:color="000000" w:sz="4"/>
+              <w:right w:val="single" w:color="000000" w:sz="4"/>
+            </w:tcBorders>
+            <w:tcMar>
+              <w:top w:type="dxa" w:w="40"/>
+              <w:left w:type="dxa" w:w="80"/>
+              <w:bottom w:type="dxa" w:w="40"/>
+              <w:right w:type="dxa" w:w="80"/>
+            </w:tcMar>
+            <w:vAlign w:val="center"/>
+          </w:tcPr>
+          <w:p>
+            <w:pPr>
+              <w:keepNext/>
+              <w:spacing w:after="0" w:line="240" w:lineRule="auto"/>
+              <w:jc w:val="left"/>
+            </w:pPr>
+            <w:r>
+              <w:rPr>
+                <w:b w:val="false"/>
+                <w:bCs w:val="false"/>
+                <w:sz w:val="17"/>
+                <w:szCs w:val="17"/>
+              </w:rPr>
+              <w:t xml:space="preserve"/>
+            </w:r>
+          </w:p>
+        </w:tc>
+        <w:tc>
+          <w:tcPr>
+            <w:tcW w:type="dxa" w:w="2300"/>
+            <w:tcBorders>
+              <w:top w:val="single" w:color="000000" w:sz="4"/>
+              <w:left w:val="single" w:color="000000" w:sz="4"/>
+              <w:bottom w:val="single" w:color="000000" w:sz="4"/>
+              <w:right w:val="single" w:color="000000" w:sz="4"/>
+            </w:tcBorders>
+            <w:tcMar>
+              <w:top w:type="dxa" w:w="40"/>
+              <w:left w:type="dxa" w:w="80"/>
+              <w:bottom w:type="dxa" w:w="40"/>
+              <w:right w:type="dxa" w:w="80"/>
+            </w:tcMar>
+            <w:vAlign w:val="center"/>
+          </w:tcPr>
+          <w:p>
+            <w:pPr>
+              <w:keepNext/>
+              <w:spacing w:after="0" w:line="240" w:lineRule="auto"/>
+              <w:jc w:val="left"/>
+            </w:pPr>
+            <w:r>
+              <w:rPr>
+                <w:b w:val="false"/>
+                <w:bCs w:val="false"/>
+                <w:sz w:val="17"/>
+                <w:szCs w:val="17"/>
+              </w:rPr>
+              <w:t xml:space="preserve">Part II reliability (KR-20)</w:t>
+            </w:r>
+          </w:p>
+        </w:tc>
+        <w:tc>
+          <w:tcPr>
+            <w:tcW w:type="dxa" w:w="2500"/>
+            <w:tcBorders>
+              <w:top w:val="single" w:color="000000" w:sz="4"/>
+              <w:left w:val="single" w:color="000000" w:sz="4"/>
+              <w:bottom w:val="single" w:color="000000" w:sz="4"/>
+              <w:right w:val="single" w:color="000000" w:sz="4"/>
+            </w:tcBorders>
+            <w:tcMar>
+              <w:top w:type="dxa" w:w="40"/>
+              <w:left w:type="dxa" w:w="80"/>
+              <w:bottom w:type="dxa" w:w="40"/>
+              <w:right w:type="dxa" w:w="80"/>
+            </w:tcMar>
+            <w:vAlign w:val="center"/>
+          </w:tcPr>
+          <w:p>
+            <w:pPr>
+              <w:keepNext/>
+              <w:spacing w:after="0" w:line="240" w:lineRule="auto"/>
+              <w:jc w:val="left"/>
+            </w:pPr>
+            <w:r>
+              <w:rPr>
+                <w:b w:val="false"/>
+                <w:bCs w:val="false"/>
+                <w:sz w:val="17"/>
+                <w:szCs w:val="17"/>
+              </w:rPr>
+              <w:t xml:space="preserve">Form A = .89; Form B = .86</w:t>
+            </w:r>
+          </w:p>
+        </w:tc>
+        <w:tc>
+          <w:tcPr>
+            <w:tcW w:type="dxa" w:w="1500"/>
+            <w:tcBorders>
+              <w:top w:val="single" w:color="000000" w:sz="4"/>
+              <w:left w:val="single" w:color="000000" w:sz="4"/>
+              <w:bottom w:val="single" w:color="000000" w:sz="4"/>
+              <w:right w:val="single" w:color="000000" w:sz="4"/>
+            </w:tcBorders>
+            <w:tcMar>
+              <w:top w:type="dxa" w:w="40"/>
+              <w:left w:type="dxa" w:w="80"/>
+              <w:bottom w:type="dxa" w:w="40"/>
+              <w:right w:type="dxa" w:w="80"/>
+            </w:tcMar>
+            <w:vAlign w:val="center"/>
+          </w:tcPr>
+          <w:p>
+            <w:pPr>
+              <w:keepNext/>
+              <w:spacing w:after="0" w:line="240" w:lineRule="auto"/>
+              <w:jc w:val="center"/>
+            </w:pPr>
+            <w:r>
+              <w:rPr>
+                <w:b w:val="false"/>
+                <w:bCs w:val="false"/>
+                <w:sz w:val="17"/>
+                <w:szCs w:val="17"/>
+              </w:rPr>
+              <w:t xml:space="preserve">≥ .70</w:t>
+            </w:r>
+          </w:p>
+        </w:tc>
+        <w:tc>
+          <w:tcPr>
+            <w:tcW w:type="dxa" w:w="1060"/>
+            <w:tcBorders>
+              <w:top w:val="single" w:color="000000" w:sz="4"/>
+              <w:left w:val="single" w:color="000000" w:sz="4"/>
+              <w:bottom w:val="single" w:color="000000" w:sz="4"/>
+              <w:right w:val="single" w:color="000000" w:sz="4"/>
+            </w:tcBorders>
+            <w:tcMar>
+              <w:top w:type="dxa" w:w="40"/>
+              <w:left w:type="dxa" w:w="80"/>
+              <w:bottom w:type="dxa" w:w="40"/>
+              <w:right w:type="dxa" w:w="80"/>
+            </w:tcMar>
+            <w:vAlign w:val="center"/>
+          </w:tcPr>
+          <w:p>
+            <w:pPr>
+              <w:keepNext/>
+              <w:spacing w:after="0" w:line="240" w:lineRule="auto"/>
+              <w:jc w:val="center"/>
+            </w:pPr>
+            <w:r>
+              <w:rPr>
+                <w:b w:val="false"/>
+                <w:bCs w:val="false"/>
+                <w:sz w:val="17"/>
+                <w:szCs w:val="17"/>
+              </w:rPr>
+              <w:t xml:space="preserve">Good</w:t>
+            </w:r>
+          </w:p>
+        </w:tc>
+      </w:tr>
+      <w:tr>
+        <w:trPr>
+          <w:cantSplit/>
+        </w:trPr>
+        <w:tc>
+          <w:tcPr>
+            <w:tcW w:type="dxa" w:w="2000"/>
+            <w:tcBorders>
+              <w:top w:val="single" w:color="000000" w:sz="4"/>
+              <w:left w:val="single" w:color="000000" w:sz="4"/>
+              <w:bottom w:val="single" w:color="000000" w:sz="4"/>
+              <w:right w:val="single" w:color="000000" w:sz="4"/>
+            </w:tcBorders>
+            <w:tcMar>
+              <w:top w:type="dxa" w:w="40"/>
+              <w:left w:type="dxa" w:w="80"/>
+              <w:bottom w:type="dxa" w:w="40"/>
+              <w:right w:type="dxa" w:w="80"/>
+            </w:tcMar>
+            <w:vAlign w:val="center"/>
+          </w:tcPr>
+          <w:p>
+            <w:pPr>
+              <w:keepNext/>
+              <w:spacing w:after="0" w:line="240" w:lineRule="auto"/>
+              <w:jc w:val="left"/>
+            </w:pPr>
+            <w:r>
+              <w:rPr>
+                <w:b w:val="false"/>
+                <w:bCs w:val="false"/>
+                <w:sz w:val="17"/>
+                <w:szCs w:val="17"/>
+              </w:rPr>
+              <w:t xml:space="preserve"/>
+            </w:r>
+          </w:p>
+        </w:tc>
+        <w:tc>
+          <w:tcPr>
+            <w:tcW w:type="dxa" w:w="2300"/>
+            <w:tcBorders>
+              <w:top w:val="single" w:color="000000" w:sz="4"/>
+              <w:left w:val="single" w:color="000000" w:sz="4"/>
+              <w:bottom w:val="single" w:color="000000" w:sz="4"/>
+              <w:right w:val="single" w:color="000000" w:sz="4"/>
+            </w:tcBorders>
+            <w:tcMar>
+              <w:top w:type="dxa" w:w="40"/>
+              <w:left w:type="dxa" w:w="80"/>
+              <w:bottom w:type="dxa" w:w="40"/>
+              <w:right w:type="dxa" w:w="80"/>
+            </w:tcMar>
+            <w:vAlign w:val="center"/>
+          </w:tcPr>
+          <w:p>
+            <w:pPr>
+              <w:keepNext/>
+              <w:spacing w:after="0" w:line="240" w:lineRule="auto"/>
+              <w:jc w:val="left"/>
+            </w:pPr>
+            <w:r>
+              <w:rPr>
+                <w:b w:val="false"/>
+                <w:bCs w:val="false"/>
+                <w:sz w:val="17"/>
+                <w:szCs w:val="17"/>
+              </w:rPr>
+              <w:t xml:space="preserve">Part IV reliability (KR-20)</w:t>
+            </w:r>
+          </w:p>
+        </w:tc>
+        <w:tc>
+          <w:tcPr>
+            <w:tcW w:type="dxa" w:w="2500"/>
+            <w:tcBorders>
+              <w:top w:val="single" w:color="000000" w:sz="4"/>
+              <w:left w:val="single" w:color="000000" w:sz="4"/>
+              <w:bottom w:val="single" w:color="000000" w:sz="4"/>
+              <w:right w:val="single" w:color="000000" w:sz="4"/>
+            </w:tcBorders>
+            <w:tcMar>
+              <w:top w:type="dxa" w:w="40"/>
+              <w:left w:type="dxa" w:w="80"/>
+              <w:bottom w:type="dxa" w:w="40"/>
+              <w:right w:type="dxa" w:w="80"/>
+            </w:tcMar>
+            <w:vAlign w:val="center"/>
+          </w:tcPr>
+          <w:p>
+            <w:pPr>
+              <w:keepNext/>
+              <w:spacing w:after="0" w:line="240" w:lineRule="auto"/>
+              <w:jc w:val="left"/>
+            </w:pPr>
+            <w:r>
+              <w:rPr>
+                <w:b w:val="false"/>
+                <w:bCs w:val="false"/>
+                <w:sz w:val="17"/>
+                <w:szCs w:val="17"/>
+              </w:rPr>
+              <w:t xml:space="preserve">Form A = .85; Form B = .81</w:t>
+            </w:r>
+          </w:p>
+        </w:tc>
+        <w:tc>
+          <w:tcPr>
+            <w:tcW w:type="dxa" w:w="1500"/>
+            <w:tcBorders>
+              <w:top w:val="single" w:color="000000" w:sz="4"/>
+              <w:left w:val="single" w:color="000000" w:sz="4"/>
+              <w:bottom w:val="single" w:color="000000" w:sz="4"/>
+              <w:right w:val="single" w:color="000000" w:sz="4"/>
+            </w:tcBorders>
+            <w:tcMar>
+              <w:top w:type="dxa" w:w="40"/>
+              <w:left w:type="dxa" w:w="80"/>
+              <w:bottom w:type="dxa" w:w="40"/>
+              <w:right w:type="dxa" w:w="80"/>
+            </w:tcMar>
+            <w:vAlign w:val="center"/>
+          </w:tcPr>
+          <w:p>
+            <w:pPr>
+              <w:keepNext/>
+              <w:spacing w:after="0" w:line="240" w:lineRule="auto"/>
+              <w:jc w:val="center"/>
+            </w:pPr>
+            <w:r>
+              <w:rPr>
+                <w:b w:val="false"/>
+                <w:bCs w:val="false"/>
+                <w:sz w:val="17"/>
+                <w:szCs w:val="17"/>
+              </w:rPr>
+              <w:t xml:space="preserve">≥ .70</w:t>
+            </w:r>
+          </w:p>
+        </w:tc>
+        <w:tc>
+          <w:tcPr>
+            <w:tcW w:type="dxa" w:w="1060"/>
+            <w:tcBorders>
+              <w:top w:val="single" w:color="000000" w:sz="4"/>
+              <w:left w:val="single" w:color="000000" w:sz="4"/>
+              <w:bottom w:val="single" w:color="000000" w:sz="4"/>
+              <w:right w:val="single" w:color="000000" w:sz="4"/>
+            </w:tcBorders>
+            <w:tcMar>
+              <w:top w:type="dxa" w:w="40"/>
+              <w:left w:type="dxa" w:w="80"/>
+              <w:bottom w:type="dxa" w:w="40"/>
+              <w:right w:type="dxa" w:w="80"/>
+            </w:tcMar>
+            <w:vAlign w:val="center"/>
+          </w:tcPr>
+          <w:p>
+            <w:pPr>
+              <w:keepNext/>
+              <w:spacing w:after="0" w:line="240" w:lineRule="auto"/>
+              <w:jc w:val="center"/>
+            </w:pPr>
+            <w:r>
+              <w:rPr>
+                <w:b w:val="false"/>
+                <w:bCs w:val="false"/>
+                <w:sz w:val="17"/>
+                <w:szCs w:val="17"/>
+              </w:rPr>
+              <w:t xml:space="preserve">Good</w:t>
+            </w:r>
+          </w:p>
+        </w:tc>
+      </w:tr>
+      <w:tr>
+        <w:trPr>
+          <w:cantSplit/>
+        </w:trPr>
+        <w:tc>
+          <w:tcPr>
+            <w:tcW w:type="dxa" w:w="2000"/>
+            <w:tcBorders>
+              <w:top w:val="single" w:color="000000" w:sz="4"/>
+              <w:left w:val="single" w:color="000000" w:sz="4"/>
+              <w:bottom w:val="single" w:color="000000" w:sz="4"/>
+              <w:right w:val="single" w:color="000000" w:sz="4"/>
+            </w:tcBorders>
+            <w:tcMar>
+              <w:top w:type="dxa" w:w="40"/>
+              <w:left w:type="dxa" w:w="80"/>
+              <w:bottom w:type="dxa" w:w="40"/>
+              <w:right w:type="dxa" w:w="80"/>
+            </w:tcMar>
+            <w:vAlign w:val="center"/>
+          </w:tcPr>
+          <w:p>
+            <w:pPr>
+              <w:keepNext/>
+              <w:spacing w:after="0" w:line="240" w:lineRule="auto"/>
+              <w:jc w:val="left"/>
+            </w:pPr>
+            <w:r>
+              <w:rPr>
+                <w:b w:val="false"/>
+                <w:bCs w:val="false"/>
+                <w:sz w:val="17"/>
+                <w:szCs w:val="17"/>
+              </w:rPr>
+              <w:t xml:space="preserve"/>
+            </w:r>
+          </w:p>
+        </w:tc>
+        <w:tc>
+          <w:tcPr>
+            <w:tcW w:type="dxa" w:w="2300"/>
+            <w:tcBorders>
+              <w:top w:val="single" w:color="000000" w:sz="4"/>
+              <w:left w:val="single" w:color="000000" w:sz="4"/>
+              <w:bottom w:val="single" w:color="000000" w:sz="4"/>
+              <w:right w:val="single" w:color="000000" w:sz="4"/>
+            </w:tcBorders>
+            <w:tcMar>
+              <w:top w:type="dxa" w:w="40"/>
+              <w:left w:type="dxa" w:w="80"/>
+              <w:bottom w:type="dxa" w:w="40"/>
+              <w:right w:type="dxa" w:w="80"/>
+            </w:tcMar>
+            <w:vAlign w:val="center"/>
+          </w:tcPr>
+          <w:p>
+            <w:pPr>
+              <w:keepNext/>
+              <w:spacing w:after="0" w:line="240" w:lineRule="auto"/>
+              <w:jc w:val="left"/>
+            </w:pPr>
+            <w:r>
+              <w:rPr>
+                <w:b w:val="false"/>
+                <w:bCs w:val="false"/>
+                <w:sz w:val="17"/>
+                <w:szCs w:val="17"/>
+              </w:rPr>
+              <w:t xml:space="preserve">Equivalence of Forms A and B (n = 25)</w:t>
+            </w:r>
+          </w:p>
+        </w:tc>
+        <w:tc>
+          <w:tcPr>
+            <w:tcW w:type="dxa" w:w="2500"/>
+            <w:tcBorders>
+              <w:top w:val="single" w:color="000000" w:sz="4"/>
+              <w:left w:val="single" w:color="000000" w:sz="4"/>
+              <w:bottom w:val="single" w:color="000000" w:sz="4"/>
+              <w:right w:val="single" w:color="000000" w:sz="4"/>
+            </w:tcBorders>
+            <w:tcMar>
+              <w:top w:type="dxa" w:w="40"/>
+              <w:left w:type="dxa" w:w="80"/>
+              <w:bottom w:type="dxa" w:w="40"/>
+              <w:right w:type="dxa" w:w="80"/>
+            </w:tcMar>
+            <w:vAlign w:val="center"/>
+          </w:tcPr>
+          <w:p>
+            <w:pPr>
+              <w:keepNext/>
+              <w:spacing w:after="0" w:line="240" w:lineRule="auto"/>
+              <w:jc w:val="left"/>
+            </w:pPr>
+            <w:r>
+              <w:rPr>
+                <w:b w:val="false"/>
+                <w:bCs w:val="false"/>
+                <w:sz w:val="17"/>
+                <w:szCs w:val="17"/>
+              </w:rPr>
+              <w:t xml:space="preserve">r = .92, p &lt; .001; t(24) = 0.03, p = .980</w:t>
+            </w:r>
+          </w:p>
+        </w:tc>
+        <w:tc>
+          <w:tcPr>
+            <w:tcW w:type="dxa" w:w="1500"/>
+            <w:tcBorders>
+              <w:top w:val="single" w:color="000000" w:sz="4"/>
+              <w:left w:val="single" w:color="000000" w:sz="4"/>
+              <w:bottom w:val="single" w:color="000000" w:sz="4"/>
+              <w:right w:val="single" w:color="000000" w:sz="4"/>
+            </w:tcBorders>
+            <w:tcMar>
+              <w:top w:type="dxa" w:w="40"/>
+              <w:left w:type="dxa" w:w="80"/>
+              <w:bottom w:type="dxa" w:w="40"/>
+              <w:right w:type="dxa" w:w="80"/>
+            </w:tcMar>
+            <w:vAlign w:val="center"/>
+          </w:tcPr>
+          <w:p>
+            <w:pPr>
+              <w:keepNext/>
+              <w:spacing w:after="0" w:line="240" w:lineRule="auto"/>
+              <w:jc w:val="center"/>
+            </w:pPr>
+            <w:r>
+              <w:rPr>
+                <w:b w:val="false"/>
+                <w:bCs w:val="false"/>
+                <w:sz w:val="17"/>
+                <w:szCs w:val="17"/>
+              </w:rPr>
+              <w:t xml:space="preserve">Strong positive r; no significant mean difference</w:t>
+            </w:r>
+          </w:p>
+        </w:tc>
+        <w:tc>
+          <w:tcPr>
+            <w:tcW w:type="dxa" w:w="1060"/>
+            <w:tcBorders>
+              <w:top w:val="single" w:color="000000" w:sz="4"/>
+              <w:left w:val="single" w:color="000000" w:sz="4"/>
+              <w:bottom w:val="single" w:color="000000" w:sz="4"/>
+              <w:right w:val="single" w:color="000000" w:sz="4"/>
+            </w:tcBorders>
+            <w:tcMar>
+              <w:top w:type="dxa" w:w="40"/>
+              <w:left w:type="dxa" w:w="80"/>
+              <w:bottom w:type="dxa" w:w="40"/>
+              <w:right w:type="dxa" w:w="80"/>
+            </w:tcMar>
+            <w:vAlign w:val="center"/>
+          </w:tcPr>
+          <w:p>
+            <w:pPr>
+              <w:keepNext/>
+              <w:spacing w:after="0" w:line="240" w:lineRule="auto"/>
+              <w:jc w:val="center"/>
+            </w:pPr>
+            <w:r>
+              <w:rPr>
+                <w:b w:val="false"/>
+                <w:bCs w:val="false"/>
+                <w:sz w:val="17"/>
+                <w:szCs w:val="17"/>
+              </w:rPr>
+              <w:t xml:space="preserve">Equivalent</w:t>
+            </w:r>
+          </w:p>
+        </w:tc>
+      </w:tr>
+      <w:tr>
+        <w:trPr>
+          <w:cantSplit/>
+        </w:trPr>
+        <w:tc>
+          <w:tcPr>
+            <w:tcW w:type="dxa" w:w="2000"/>
+            <w:tcBorders>
+              <w:top w:val="single" w:color="000000" w:sz="4"/>
+              <w:left w:val="single" w:color="000000" w:sz="4"/>
+              <w:bottom w:val="single" w:color="000000" w:sz="4"/>
+              <w:right w:val="single" w:color="000000" w:sz="4"/>
+            </w:tcBorders>
+            <w:tcMar>
+              <w:top w:type="dxa" w:w="40"/>
+              <w:left w:type="dxa" w:w="80"/>
+              <w:bottom w:type="dxa" w:w="40"/>
+              <w:right w:type="dxa" w:w="80"/>
+            </w:tcMar>
+            <w:vAlign w:val="center"/>
+          </w:tcPr>
+          <w:p>
+            <w:pPr>
+              <w:keepNext/>
+              <w:spacing w:after="0" w:line="240" w:lineRule="auto"/>
+              <w:jc w:val="left"/>
+            </w:pPr>
+            <w:r>
+              <w:rPr>
+                <w:b w:val="false"/>
+                <w:bCs w:val="false"/>
+                <w:sz w:val="17"/>
+                <w:szCs w:val="17"/>
+              </w:rPr>
+              <w:t xml:space="preserve"/>
+            </w:r>
+          </w:p>
+        </w:tc>
+        <w:tc>
+          <w:tcPr>
+            <w:tcW w:type="dxa" w:w="2300"/>
+            <w:tcBorders>
+              <w:top w:val="single" w:color="000000" w:sz="4"/>
+              <w:left w:val="single" w:color="000000" w:sz="4"/>
+              <w:bottom w:val="single" w:color="000000" w:sz="4"/>
+              <w:right w:val="single" w:color="000000" w:sz="4"/>
+            </w:tcBorders>
+            <w:tcMar>
+              <w:top w:type="dxa" w:w="40"/>
+              <w:left w:type="dxa" w:w="80"/>
+              <w:bottom w:type="dxa" w:w="40"/>
+              <w:right w:type="dxa" w:w="80"/>
+            </w:tcMar>
+            <w:vAlign w:val="center"/>
+          </w:tcPr>
+          <w:p>
+            <w:pPr>
+              <w:keepNext/>
+              <w:spacing w:after="0" w:line="240" w:lineRule="auto"/>
+              <w:jc w:val="left"/>
+            </w:pPr>
+            <w:r>
+              <w:rPr>
+                <w:b w:val="false"/>
+                <w:bCs w:val="false"/>
+                <w:sz w:val="17"/>
+                <w:szCs w:val="17"/>
+              </w:rPr>
+              <w:t xml:space="preserve">Inter-rater agreement (oral reading)</w:t>
+            </w:r>
+          </w:p>
+        </w:tc>
+        <w:tc>
+          <w:tcPr>
+            <w:tcW w:type="dxa" w:w="2500"/>
+            <w:tcBorders>
+              <w:top w:val="single" w:color="000000" w:sz="4"/>
+              <w:left w:val="single" w:color="000000" w:sz="4"/>
+              <w:bottom w:val="single" w:color="000000" w:sz="4"/>
+              <w:right w:val="single" w:color="000000" w:sz="4"/>
+            </w:tcBorders>
+            <w:tcMar>
+              <w:top w:type="dxa" w:w="40"/>
+              <w:left w:type="dxa" w:w="80"/>
+              <w:bottom w:type="dxa" w:w="40"/>
+              <w:right w:type="dxa" w:w="80"/>
+            </w:tcMar>
+            <w:vAlign w:val="center"/>
+          </w:tcPr>
+          <w:p>
+            <w:pPr>
+              <w:keepNext/>
+              <w:spacing w:after="0" w:line="240" w:lineRule="auto"/>
+              <w:jc w:val="left"/>
+            </w:pPr>
+            <w:r>
+              <w:rPr>
+                <w:b w:val="false"/>
+                <w:bCs w:val="false"/>
+                <w:sz w:val="17"/>
+                <w:szCs w:val="17"/>
+              </w:rPr>
+              <w:t xml:space="preserve">95.7% (6 recordings, 468 words)</w:t>
+            </w:r>
+          </w:p>
+        </w:tc>
+        <w:tc>
+          <w:tcPr>
+            <w:tcW w:type="dxa" w:w="1500"/>
+            <w:tcBorders>
+              <w:top w:val="single" w:color="000000" w:sz="4"/>
+              <w:left w:val="single" w:color="000000" w:sz="4"/>
+              <w:bottom w:val="single" w:color="000000" w:sz="4"/>
+              <w:right w:val="single" w:color="000000" w:sz="4"/>
+            </w:tcBorders>
+            <w:tcMar>
+              <w:top w:type="dxa" w:w="40"/>
+              <w:left w:type="dxa" w:w="80"/>
+              <w:bottom w:type="dxa" w:w="40"/>
+              <w:right w:type="dxa" w:w="80"/>
+            </w:tcMar>
+            <w:vAlign w:val="center"/>
+          </w:tcPr>
+          <w:p>
+            <w:pPr>
+              <w:keepNext/>
+              <w:spacing w:after="0" w:line="240" w:lineRule="auto"/>
+              <w:jc w:val="center"/>
+            </w:pPr>
+            <w:r>
+              <w:rPr>
+                <w:b w:val="false"/>
+                <w:bCs w:val="false"/>
+                <w:sz w:val="17"/>
+                <w:szCs w:val="17"/>
+              </w:rPr>
+              <w:t xml:space="preserve">≥ 90%</w:t>
+            </w:r>
+          </w:p>
+        </w:tc>
+        <w:tc>
+          <w:tcPr>
+            <w:tcW w:type="dxa" w:w="1060"/>
+            <w:tcBorders>
+              <w:top w:val="single" w:color="000000" w:sz="4"/>
+              <w:left w:val="single" w:color="000000" w:sz="4"/>
+              <w:bottom w:val="single" w:color="000000" w:sz="4"/>
+              <w:right w:val="single" w:color="000000" w:sz="4"/>
+            </w:tcBorders>
+            <w:tcMar>
+              <w:top w:type="dxa" w:w="40"/>
+              <w:left w:type="dxa" w:w="80"/>
+              <w:bottom w:type="dxa" w:w="40"/>
+              <w:right w:type="dxa" w:w="80"/>
+            </w:tcMar>
+            <w:vAlign w:val="center"/>
+          </w:tcPr>
+          <w:p>
+            <w:pPr>
+              <w:keepNext/>
+              <w:spacing w:after="0" w:line="240" w:lineRule="auto"/>
+              <w:jc w:val="center"/>
+            </w:pPr>
+            <w:r>
+              <w:rPr>
+                <w:b w:val="false"/>
+                <w:bCs w:val="false"/>
+                <w:sz w:val="17"/>
+                <w:szCs w:val="17"/>
+              </w:rPr>
+              <w:t xml:space="preserve">Acceptable</w:t>
+            </w:r>
+          </w:p>
+        </w:tc>
+      </w:tr>
+      <w:tr>
+        <w:trPr>
+          <w:cantSplit/>
+        </w:trPr>
+        <w:tc>
+          <w:tcPr>
+            <w:tcW w:type="dxa" w:w="2000"/>
+            <w:tcBorders>
+              <w:top w:val="single" w:color="000000" w:sz="4"/>
+              <w:left w:val="single" w:color="000000" w:sz="4"/>
+              <w:bottom w:val="single" w:color="000000" w:sz="4"/>
+              <w:right w:val="single" w:color="000000" w:sz="4"/>
+            </w:tcBorders>
+            <w:tcMar>
+              <w:top w:type="dxa" w:w="40"/>
+              <w:left w:type="dxa" w:w="80"/>
+              <w:bottom w:type="dxa" w:w="40"/>
+              <w:right w:type="dxa" w:w="80"/>
+            </w:tcMar>
+            <w:vAlign w:val="center"/>
+          </w:tcPr>
+          <w:p>
+            <w:pPr>
+              <w:keepNext/>
+              <w:spacing w:after="0" w:line="240" w:lineRule="auto"/>
+              <w:jc w:val="left"/>
+            </w:pPr>
+            <w:r>
+              <w:rPr>
+                <w:b w:val="false"/>
+                <w:bCs w:val="false"/>
+                <w:sz w:val="17"/>
+                <w:szCs w:val="17"/>
+              </w:rPr>
+              <w:t xml:space="preserve">Acceptability Evaluation Tool</w:t>
+            </w:r>
+          </w:p>
+        </w:tc>
+        <w:tc>
+          <w:tcPr>
+            <w:tcW w:type="dxa" w:w="2300"/>
+            <w:tcBorders>
+              <w:top w:val="single" w:color="000000" w:sz="4"/>
+              <w:left w:val="single" w:color="000000" w:sz="4"/>
+              <w:bottom w:val="single" w:color="000000" w:sz="4"/>
+              <w:right w:val="single" w:color="000000" w:sz="4"/>
+            </w:tcBorders>
+            <w:tcMar>
+              <w:top w:type="dxa" w:w="40"/>
+              <w:left w:type="dxa" w:w="80"/>
+              <w:bottom w:type="dxa" w:w="40"/>
+              <w:right w:type="dxa" w:w="80"/>
+            </w:tcMar>
+            <w:vAlign w:val="center"/>
+          </w:tcPr>
+          <w:p>
+            <w:pPr>
+              <w:keepNext/>
+              <w:spacing w:after="0" w:line="240" w:lineRule="auto"/>
+              <w:jc w:val="left"/>
+            </w:pPr>
+            <w:r>
+              <w:rPr>
+                <w:b w:val="false"/>
+                <w:bCs w:val="false"/>
+                <w:sz w:val="17"/>
+                <w:szCs w:val="17"/>
+              </w:rPr>
+              <w:t xml:space="preserve">Content validity (6 experts, 20 items)</w:t>
+            </w:r>
+          </w:p>
+        </w:tc>
+        <w:tc>
+          <w:tcPr>
+            <w:tcW w:type="dxa" w:w="2500"/>
+            <w:tcBorders>
+              <w:top w:val="single" w:color="000000" w:sz="4"/>
+              <w:left w:val="single" w:color="000000" w:sz="4"/>
+              <w:bottom w:val="single" w:color="000000" w:sz="4"/>
+              <w:right w:val="single" w:color="000000" w:sz="4"/>
+            </w:tcBorders>
+            <w:tcMar>
+              <w:top w:type="dxa" w:w="40"/>
+              <w:left w:type="dxa" w:w="80"/>
+              <w:bottom w:type="dxa" w:w="40"/>
+              <w:right w:type="dxa" w:w="80"/>
+            </w:tcMar>
+            <w:vAlign w:val="center"/>
+          </w:tcPr>
+          <w:p>
+            <w:pPr>
+              <w:keepNext/>
+              <w:spacing w:after="0" w:line="240" w:lineRule="auto"/>
+              <w:jc w:val="left"/>
+            </w:pPr>
+            <w:r>
+              <w:rPr>
+                <w:b w:val="false"/>
+                <w:bCs w:val="false"/>
+                <w:sz w:val="17"/>
+                <w:szCs w:val="17"/>
+              </w:rPr>
+              <w:t xml:space="preserve">I-CVI = .67–1.00; 1 item revised; S-CVI/Ave = .93</w:t>
+            </w:r>
+          </w:p>
+        </w:tc>
+        <w:tc>
+          <w:tcPr>
+            <w:tcW w:type="dxa" w:w="1500"/>
+            <w:tcBorders>
+              <w:top w:val="single" w:color="000000" w:sz="4"/>
+              <w:left w:val="single" w:color="000000" w:sz="4"/>
+              <w:bottom w:val="single" w:color="000000" w:sz="4"/>
+              <w:right w:val="single" w:color="000000" w:sz="4"/>
+            </w:tcBorders>
+            <w:tcMar>
+              <w:top w:type="dxa" w:w="40"/>
+              <w:left w:type="dxa" w:w="80"/>
+              <w:bottom w:type="dxa" w:w="40"/>
+              <w:right w:type="dxa" w:w="80"/>
+            </w:tcMar>
+            <w:vAlign w:val="center"/>
+          </w:tcPr>
+          <w:p>
+            <w:pPr>
+              <w:keepNext/>
+              <w:spacing w:after="0" w:line="240" w:lineRule="auto"/>
+              <w:jc w:val="center"/>
+            </w:pPr>
+            <w:r>
+              <w:rPr>
+                <w:b w:val="false"/>
+                <w:bCs w:val="false"/>
+                <w:sz w:val="17"/>
+                <w:szCs w:val="17"/>
+              </w:rPr>
+              <w:t xml:space="preserve">I-CVI ≥ .78; S-CVI/Ave ≥ .90</w:t>
+            </w:r>
+          </w:p>
+        </w:tc>
+        <w:tc>
+          <w:tcPr>
+            <w:tcW w:type="dxa" w:w="1060"/>
+            <w:tcBorders>
+              <w:top w:val="single" w:color="000000" w:sz="4"/>
+              <w:left w:val="single" w:color="000000" w:sz="4"/>
+              <w:bottom w:val="single" w:color="000000" w:sz="4"/>
+              <w:right w:val="single" w:color="000000" w:sz="4"/>
+            </w:tcBorders>
+            <w:tcMar>
+              <w:top w:type="dxa" w:w="40"/>
+              <w:left w:type="dxa" w:w="80"/>
+              <w:bottom w:type="dxa" w:w="40"/>
+              <w:right w:type="dxa" w:w="80"/>
+            </w:tcMar>
+            <w:vAlign w:val="center"/>
+          </w:tcPr>
+          <w:p>
+            <w:pPr>
+              <w:keepNext/>
+              <w:spacing w:after="0" w:line="240" w:lineRule="auto"/>
+              <w:jc w:val="center"/>
+            </w:pPr>
+            <w:r>
+              <w:rPr>
+                <w:b w:val="false"/>
+                <w:bCs w:val="false"/>
+                <w:sz w:val="17"/>
+                <w:szCs w:val="17"/>
+              </w:rPr>
+              <w:t xml:space="preserve">Excellent</w:t>
+            </w:r>
+          </w:p>
+        </w:tc>
+      </w:tr>
+      <w:tr>
+        <w:trPr>
+          <w:cantSplit/>
+        </w:trPr>
+        <w:tc>
+          <w:tcPr>
+            <w:tcW w:type="dxa" w:w="2000"/>
+            <w:tcBorders>
+              <w:top w:val="single" w:color="000000" w:sz="4"/>
+              <w:left w:val="single" w:color="000000" w:sz="4"/>
+              <w:bottom w:val="single" w:color="000000" w:sz="4"/>
+              <w:right w:val="single" w:color="000000" w:sz="4"/>
+            </w:tcBorders>
+            <w:tcMar>
+              <w:top w:type="dxa" w:w="40"/>
+              <w:left w:type="dxa" w:w="80"/>
+              <w:bottom w:type="dxa" w:w="40"/>
+              <w:right w:type="dxa" w:w="80"/>
+            </w:tcMar>
+            <w:vAlign w:val="center"/>
+          </w:tcPr>
+          <w:p>
+            <w:pPr>
+              <w:keepNext w:val="false"/>
+              <w:spacing w:after="0" w:line="240" w:lineRule="auto"/>
+              <w:jc w:val="left"/>
+            </w:pPr>
+            <w:r>
+              <w:rPr>
+                <w:b w:val="false"/>
+                <w:bCs w:val="false"/>
+                <w:sz w:val="17"/>
+                <w:szCs w:val="17"/>
+              </w:rPr>
+              <w:t xml:space="preserve"/>
+            </w:r>
+          </w:p>
+        </w:tc>
+        <w:tc>
+          <w:tcPr>
+            <w:tcW w:type="dxa" w:w="2300"/>
+            <w:tcBorders>
+              <w:top w:val="single" w:color="000000" w:sz="4"/>
+              <w:left w:val="single" w:color="000000" w:sz="4"/>
+              <w:bottom w:val="single" w:color="000000" w:sz="4"/>
+              <w:right w:val="single" w:color="000000" w:sz="4"/>
+            </w:tcBorders>
+            <w:tcMar>
+              <w:top w:type="dxa" w:w="40"/>
+              <w:left w:type="dxa" w:w="80"/>
+              <w:bottom w:type="dxa" w:w="40"/>
+              <w:right w:type="dxa" w:w="80"/>
+            </w:tcMar>
+            <w:vAlign w:val="center"/>
+          </w:tcPr>
+          <w:p>
+            <w:pPr>
+              <w:keepNext w:val="false"/>
+              <w:spacing w:after="0" w:line="240" w:lineRule="auto"/>
+              <w:jc w:val="left"/>
+            </w:pPr>
+            <w:r>
+              <w:rPr>
+                <w:b w:val="false"/>
+                <w:bCs w:val="false"/>
+                <w:sz w:val="17"/>
+                <w:szCs w:val="17"/>
+              </w:rPr>
+              <w:t xml:space="preserve">Internal consistency (Cronbach’s alpha)</w:t>
+            </w:r>
+          </w:p>
+        </w:tc>
+        <w:tc>
+          <w:tcPr>
+            <w:tcW w:type="dxa" w:w="2500"/>
+            <w:tcBorders>
+              <w:top w:val="single" w:color="000000" w:sz="4"/>
+              <w:left w:val="single" w:color="000000" w:sz="4"/>
+              <w:bottom w:val="single" w:color="000000" w:sz="4"/>
+              <w:right w:val="single" w:color="000000" w:sz="4"/>
+            </w:tcBorders>
+            <w:tcMar>
+              <w:top w:type="dxa" w:w="40"/>
+              <w:left w:type="dxa" w:w="80"/>
+              <w:bottom w:type="dxa" w:w="40"/>
+              <w:right w:type="dxa" w:w="80"/>
+            </w:tcMar>
+            <w:vAlign w:val="center"/>
+          </w:tcPr>
+          <w:p>
+            <w:pPr>
+              <w:keepNext w:val="false"/>
+              <w:spacing w:after="0" w:line="240" w:lineRule="auto"/>
+              <w:jc w:val="left"/>
+            </w:pPr>
+            <w:r>
+              <w:rPr>
+                <w:b w:val="false"/>
+                <w:bCs w:val="false"/>
+                <w:sz w:val="17"/>
+                <w:szCs w:val="17"/>
+              </w:rPr>
+              <w:t xml:space="preserve">α = .86 (8 teachers)</w:t>
+            </w:r>
+          </w:p>
+        </w:tc>
+        <w:tc>
+          <w:tcPr>
+            <w:tcW w:type="dxa" w:w="1500"/>
+            <w:tcBorders>
+              <w:top w:val="single" w:color="000000" w:sz="4"/>
+              <w:left w:val="single" w:color="000000" w:sz="4"/>
+              <w:bottom w:val="single" w:color="000000" w:sz="4"/>
+              <w:right w:val="single" w:color="000000" w:sz="4"/>
+            </w:tcBorders>
+            <w:tcMar>
+              <w:top w:type="dxa" w:w="40"/>
+              <w:left w:type="dxa" w:w="80"/>
+              <w:bottom w:type="dxa" w:w="40"/>
+              <w:right w:type="dxa" w:w="80"/>
+            </w:tcMar>
+            <w:vAlign w:val="center"/>
+          </w:tcPr>
+          <w:p>
+            <w:pPr>
+              <w:keepNext w:val="false"/>
+              <w:spacing w:after="0" w:line="240" w:lineRule="auto"/>
+              <w:jc w:val="center"/>
+            </w:pPr>
+            <w:r>
+              <w:rPr>
+                <w:b w:val="false"/>
+                <w:bCs w:val="false"/>
+                <w:sz w:val="17"/>
+                <w:szCs w:val="17"/>
+              </w:rPr>
+              <w:t xml:space="preserve">≥ .70</w:t>
+            </w:r>
+          </w:p>
+        </w:tc>
+        <w:tc>
+          <w:tcPr>
+            <w:tcW w:type="dxa" w:w="1060"/>
+            <w:tcBorders>
+              <w:top w:val="single" w:color="000000" w:sz="4"/>
+              <w:left w:val="single" w:color="000000" w:sz="4"/>
+              <w:bottom w:val="single" w:color="000000" w:sz="4"/>
+              <w:right w:val="single" w:color="000000" w:sz="4"/>
+            </w:tcBorders>
+            <w:tcMar>
+              <w:top w:type="dxa" w:w="40"/>
+              <w:left w:type="dxa" w:w="80"/>
+              <w:bottom w:type="dxa" w:w="40"/>
+              <w:right w:type="dxa" w:w="80"/>
+            </w:tcMar>
+            <w:vAlign w:val="center"/>
+          </w:tcPr>
+          <w:p>
+            <w:pPr>
+              <w:keepNext w:val="false"/>
+              <w:spacing w:after="0" w:line="240" w:lineRule="auto"/>
+              <w:jc w:val="center"/>
+            </w:pPr>
+            <w:r>
+              <w:rPr>
+                <w:b w:val="false"/>
+                <w:bCs w:val="false"/>
+                <w:sz w:val="17"/>
+                <w:szCs w:val="17"/>
+              </w:rPr>
+              <w:t xml:space="preserve">Good</w:t>
+            </w:r>
+          </w:p>
+        </w:tc>
+      </w:tr>
+    </w:tbl>
+    <w:p>
+      <w:pPr>
+        <w:spacing w:after="80"/>
+      </w:pPr>
     </w:p>
     <w:p>
       <w:pPr>
@@ -28397,7 +30064,7 @@
         <w:jc w:val="both"/>
       </w:pPr>
       <w:r>
-        <w:t xml:space="preserve">Table 3 presents the individual pre-test and post-test scores of the 15 Grade 2 struggling readers.</w:t>
+        <w:t xml:space="preserve">Table 4 presents the individual pre-test and post-test scores of the 15 Grade 2 struggling readers.</w:t>
       </w:r>
     </w:p>
     <w:p>
@@ -28411,7 +30078,7 @@
           <w:b/>
           <w:bCs/>
         </w:rPr>
-        <w:t xml:space="preserve">Table 3. </w:t>
+        <w:t xml:space="preserve">Table 4. </w:t>
       </w:r>
       <w:r>
         <w:rPr>
@@ -29235,7 +30902,7 @@
                 <w:sz w:val="18"/>
                 <w:szCs w:val="18"/>
               </w:rPr>
-              <w:t xml:space="preserve">94.9</w:t>
+              <w:t xml:space="preserve">93.6</w:t>
             </w:r>
           </w:p>
         </w:tc>
@@ -29303,7 +30970,7 @@
                 <w:sz w:val="18"/>
                 <w:szCs w:val="18"/>
               </w:rPr>
-              <w:t xml:space="preserve">46</w:t>
+              <w:t xml:space="preserve">45</w:t>
             </w:r>
           </w:p>
         </w:tc>
@@ -29546,7 +31213,7 @@
                 <w:sz w:val="18"/>
                 <w:szCs w:val="18"/>
               </w:rPr>
-              <w:t xml:space="preserve">17</w:t>
+              <w:t xml:space="preserve">16</w:t>
             </w:r>
           </w:p>
         </w:tc>
@@ -29614,7 +31281,7 @@
                 <w:sz w:val="18"/>
                 <w:szCs w:val="18"/>
               </w:rPr>
-              <w:t xml:space="preserve">80.8</w:t>
+              <w:t xml:space="preserve">78.2</w:t>
             </w:r>
           </w:p>
         </w:tc>
@@ -29682,7 +31349,7 @@
                 <w:sz w:val="18"/>
                 <w:szCs w:val="18"/>
               </w:rPr>
-              <w:t xml:space="preserve">26</w:t>
+              <w:t xml:space="preserve">24</w:t>
             </w:r>
           </w:p>
         </w:tc>
@@ -29857,7 +31524,7 @@
                 <w:sz w:val="18"/>
                 <w:szCs w:val="18"/>
               </w:rPr>
-              <w:t xml:space="preserve">17</w:t>
+              <w:t xml:space="preserve">15</w:t>
             </w:r>
           </w:p>
         </w:tc>
@@ -29925,7 +31592,7 @@
                 <w:sz w:val="18"/>
                 <w:szCs w:val="18"/>
               </w:rPr>
-              <w:t xml:space="preserve">20</w:t>
+              <w:t xml:space="preserve">18</w:t>
             </w:r>
           </w:p>
         </w:tc>
@@ -29993,7 +31660,7 @@
                 <w:sz w:val="18"/>
                 <w:szCs w:val="18"/>
               </w:rPr>
-              <w:t xml:space="preserve">89.7</w:t>
+              <w:t xml:space="preserve">85.9</w:t>
             </w:r>
           </w:p>
         </w:tc>
@@ -30061,7 +31728,7 @@
                 <w:sz w:val="18"/>
                 <w:szCs w:val="18"/>
               </w:rPr>
-              <w:t xml:space="preserve">40</w:t>
+              <w:t xml:space="preserve">36</w:t>
             </w:r>
           </w:p>
         </w:tc>
@@ -30129,7 +31796,7 @@
                 <w:sz w:val="18"/>
                 <w:szCs w:val="18"/>
               </w:rPr>
-              <w:t xml:space="preserve">6</w:t>
+              <w:t xml:space="preserve">5</w:t>
             </w:r>
           </w:p>
         </w:tc>
@@ -30236,7 +31903,7 @@
                 <w:sz w:val="18"/>
                 <w:szCs w:val="18"/>
               </w:rPr>
-              <w:t xml:space="preserve">9</w:t>
+              <w:t xml:space="preserve">7</w:t>
             </w:r>
           </w:p>
         </w:tc>
@@ -30304,7 +31971,7 @@
                 <w:sz w:val="18"/>
                 <w:szCs w:val="18"/>
               </w:rPr>
-              <w:t xml:space="preserve">9</w:t>
+              <w:t xml:space="preserve">6</w:t>
             </w:r>
           </w:p>
         </w:tc>
@@ -30372,7 +32039,7 @@
                 <w:sz w:val="18"/>
                 <w:szCs w:val="18"/>
               </w:rPr>
-              <w:t xml:space="preserve">69.2</w:t>
+              <w:t xml:space="preserve">65.4</w:t>
             </w:r>
           </w:p>
         </w:tc>
@@ -30440,7 +32107,7 @@
                 <w:sz w:val="18"/>
                 <w:szCs w:val="18"/>
               </w:rPr>
-              <w:t xml:space="preserve">17</w:t>
+              <w:t xml:space="preserve">13</w:t>
             </w:r>
           </w:p>
         </w:tc>
@@ -30615,7 +32282,7 @@
                 <w:sz w:val="18"/>
                 <w:szCs w:val="18"/>
               </w:rPr>
-              <w:t xml:space="preserve">17</w:t>
+              <w:t xml:space="preserve">18</w:t>
             </w:r>
           </w:p>
         </w:tc>
@@ -30751,7 +32418,7 @@
                 <w:sz w:val="18"/>
                 <w:szCs w:val="18"/>
               </w:rPr>
-              <w:t xml:space="preserve">94.9</w:t>
+              <w:t xml:space="preserve">93.6</w:t>
             </w:r>
           </w:p>
         </w:tc>
@@ -30819,7 +32486,7 @@
                 <w:sz w:val="18"/>
                 <w:szCs w:val="18"/>
               </w:rPr>
-              <w:t xml:space="preserve">46</w:t>
+              <w:t xml:space="preserve">45</w:t>
             </w:r>
           </w:p>
         </w:tc>
@@ -30994,7 +32661,7 @@
                 <w:sz w:val="18"/>
                 <w:szCs w:val="18"/>
               </w:rPr>
-              <w:t xml:space="preserve">19</w:t>
+              <w:t xml:space="preserve">17</w:t>
             </w:r>
           </w:p>
         </w:tc>
@@ -31062,7 +32729,7 @@
                 <w:sz w:val="18"/>
                 <w:szCs w:val="18"/>
               </w:rPr>
-              <w:t xml:space="preserve">23</w:t>
+              <w:t xml:space="preserve">21</w:t>
             </w:r>
           </w:p>
         </w:tc>
@@ -31130,7 +32797,7 @@
                 <w:sz w:val="18"/>
                 <w:szCs w:val="18"/>
               </w:rPr>
-              <w:t xml:space="preserve">91.0</w:t>
+              <w:t xml:space="preserve">88.5</w:t>
             </w:r>
           </w:p>
         </w:tc>
@@ -31198,7 +32865,7 @@
                 <w:sz w:val="18"/>
                 <w:szCs w:val="18"/>
               </w:rPr>
-              <w:t xml:space="preserve">47</w:t>
+              <w:t xml:space="preserve">42</w:t>
             </w:r>
           </w:p>
         </w:tc>
@@ -31266,7 +32933,7 @@
                 <w:sz w:val="18"/>
                 <w:szCs w:val="18"/>
               </w:rPr>
-              <w:t xml:space="preserve">7</w:t>
+              <w:t xml:space="preserve">6</w:t>
             </w:r>
           </w:p>
         </w:tc>
@@ -31441,7 +33108,7 @@
                 <w:sz w:val="18"/>
                 <w:szCs w:val="18"/>
               </w:rPr>
-              <w:t xml:space="preserve">12</w:t>
+              <w:t xml:space="preserve">11</w:t>
             </w:r>
           </w:p>
         </w:tc>
@@ -31509,7 +33176,7 @@
                 <w:sz w:val="18"/>
                 <w:szCs w:val="18"/>
               </w:rPr>
-              <w:t xml:space="preserve">75.6</w:t>
+              <w:t xml:space="preserve">71.8</w:t>
             </w:r>
           </w:p>
         </w:tc>
@@ -31577,7 +33244,7 @@
                 <w:sz w:val="18"/>
                 <w:szCs w:val="18"/>
               </w:rPr>
-              <w:t xml:space="preserve">22</w:t>
+              <w:t xml:space="preserve">19</w:t>
             </w:r>
           </w:p>
         </w:tc>
@@ -31752,7 +33419,7 @@
                 <w:sz w:val="18"/>
                 <w:szCs w:val="18"/>
               </w:rPr>
-              <w:t xml:space="preserve">15</w:t>
+              <w:t xml:space="preserve">13</w:t>
             </w:r>
           </w:p>
         </w:tc>
@@ -31888,7 +33555,7 @@
                 <w:sz w:val="18"/>
                 <w:szCs w:val="18"/>
               </w:rPr>
-              <w:t xml:space="preserve">94.9</w:t>
+              <w:t xml:space="preserve">93.6</w:t>
             </w:r>
           </w:p>
         </w:tc>
@@ -31956,7 +33623,7 @@
                 <w:sz w:val="18"/>
                 <w:szCs w:val="18"/>
               </w:rPr>
-              <w:t xml:space="preserve">45</w:t>
+              <w:t xml:space="preserve">44</w:t>
             </w:r>
           </w:p>
         </w:tc>
@@ -32131,7 +33798,7 @@
                 <w:sz w:val="18"/>
                 <w:szCs w:val="18"/>
               </w:rPr>
-              <w:t xml:space="preserve">9</w:t>
+              <w:t xml:space="preserve">7</w:t>
             </w:r>
           </w:p>
         </w:tc>
@@ -32199,7 +33866,7 @@
                 <w:sz w:val="18"/>
                 <w:szCs w:val="18"/>
               </w:rPr>
-              <w:t xml:space="preserve">8</w:t>
+              <w:t xml:space="preserve">6</w:t>
             </w:r>
           </w:p>
         </w:tc>
@@ -32267,7 +33934,7 @@
                 <w:sz w:val="18"/>
                 <w:szCs w:val="18"/>
               </w:rPr>
-              <w:t xml:space="preserve">69.2</w:t>
+              <w:t xml:space="preserve">65.4</w:t>
             </w:r>
           </w:p>
         </w:tc>
@@ -32335,7 +34002,7 @@
                 <w:sz w:val="18"/>
                 <w:szCs w:val="18"/>
               </w:rPr>
-              <w:t xml:space="preserve">16</w:t>
+              <w:t xml:space="preserve">13</w:t>
             </w:r>
           </w:p>
         </w:tc>
@@ -32403,7 +34070,7 @@
                 <w:sz w:val="18"/>
                 <w:szCs w:val="18"/>
               </w:rPr>
-              <w:t xml:space="preserve">2</w:t>
+              <w:t xml:space="preserve">1</w:t>
             </w:r>
           </w:p>
         </w:tc>
@@ -32646,7 +34313,7 @@
                 <w:sz w:val="18"/>
                 <w:szCs w:val="18"/>
               </w:rPr>
-              <w:t xml:space="preserve">93.6</w:t>
+              <w:t xml:space="preserve">92.3</w:t>
             </w:r>
           </w:p>
         </w:tc>
@@ -32714,7 +34381,7 @@
                 <w:sz w:val="18"/>
                 <w:szCs w:val="18"/>
               </w:rPr>
-              <w:t xml:space="preserve">44</w:t>
+              <w:t xml:space="preserve">43</w:t>
             </w:r>
           </w:p>
         </w:tc>
@@ -32889,7 +34556,7 @@
                 <w:sz w:val="18"/>
                 <w:szCs w:val="18"/>
               </w:rPr>
-              <w:t xml:space="preserve">19</w:t>
+              <w:t xml:space="preserve">18</w:t>
             </w:r>
           </w:p>
         </w:tc>
@@ -32957,7 +34624,7 @@
                 <w:sz w:val="18"/>
                 <w:szCs w:val="18"/>
               </w:rPr>
-              <w:t xml:space="preserve">25</w:t>
+              <w:t xml:space="preserve">23</w:t>
             </w:r>
           </w:p>
         </w:tc>
@@ -33025,7 +34692,7 @@
                 <w:sz w:val="18"/>
                 <w:szCs w:val="18"/>
               </w:rPr>
-              <w:t xml:space="preserve">94.9</w:t>
+              <w:t xml:space="preserve">91.0</w:t>
             </w:r>
           </w:p>
         </w:tc>
@@ -33093,7 +34760,7 @@
                 <w:sz w:val="18"/>
                 <w:szCs w:val="18"/>
               </w:rPr>
-              <w:t xml:space="preserve">51</w:t>
+              <w:t xml:space="preserve">46</w:t>
             </w:r>
           </w:p>
         </w:tc>
@@ -33161,7 +34828,7 @@
                 <w:sz w:val="18"/>
                 <w:szCs w:val="18"/>
               </w:rPr>
-              <w:t xml:space="preserve">8</w:t>
+              <w:t xml:space="preserve">7</w:t>
             </w:r>
           </w:p>
         </w:tc>
@@ -33336,7 +35003,7 @@
                 <w:sz w:val="18"/>
                 <w:szCs w:val="18"/>
               </w:rPr>
-              <w:t xml:space="preserve">15</w:t>
+              <w:t xml:space="preserve">13</w:t>
             </w:r>
           </w:p>
         </w:tc>
@@ -33404,7 +35071,7 @@
                 <w:sz w:val="18"/>
                 <w:szCs w:val="18"/>
               </w:rPr>
-              <w:t xml:space="preserve">87.2</w:t>
+              <w:t xml:space="preserve">85.9</w:t>
             </w:r>
           </w:p>
         </w:tc>
@@ -33472,7 +35139,7 @@
                 <w:sz w:val="18"/>
                 <w:szCs w:val="18"/>
               </w:rPr>
-              <w:t xml:space="preserve">32</w:t>
+              <w:t xml:space="preserve">30</w:t>
             </w:r>
           </w:p>
         </w:tc>
@@ -33647,7 +35314,7 @@
                 <w:sz w:val="18"/>
                 <w:szCs w:val="18"/>
               </w:rPr>
-              <w:t xml:space="preserve">11</w:t>
+              <w:t xml:space="preserve">10</w:t>
             </w:r>
           </w:p>
         </w:tc>
@@ -33715,7 +35382,7 @@
                 <w:sz w:val="18"/>
                 <w:szCs w:val="18"/>
               </w:rPr>
-              <w:t xml:space="preserve">17</w:t>
+              <w:t xml:space="preserve">16</w:t>
             </w:r>
           </w:p>
         </w:tc>
@@ -33783,7 +35450,7 @@
                 <w:sz w:val="18"/>
                 <w:szCs w:val="18"/>
               </w:rPr>
-              <w:t xml:space="preserve">76.9</w:t>
+              <w:t xml:space="preserve">74.4</w:t>
             </w:r>
           </w:p>
         </w:tc>
@@ -33851,7 +35518,7 @@
                 <w:sz w:val="18"/>
                 <w:szCs w:val="18"/>
               </w:rPr>
-              <w:t xml:space="preserve">24</w:t>
+              <w:t xml:space="preserve">21</w:t>
             </w:r>
           </w:p>
         </w:tc>
@@ -33919,7 +35586,7 @@
                 <w:sz w:val="18"/>
                 <w:szCs w:val="18"/>
               </w:rPr>
-              <w:t xml:space="preserve">3</w:t>
+              <w:t xml:space="preserve">2</w:t>
             </w:r>
           </w:p>
         </w:tc>
@@ -34026,7 +35693,7 @@
                 <w:sz w:val="18"/>
                 <w:szCs w:val="18"/>
               </w:rPr>
-              <w:t xml:space="preserve">20</w:t>
+              <w:t xml:space="preserve">19</w:t>
             </w:r>
           </w:p>
         </w:tc>
@@ -34094,7 +35761,7 @@
                 <w:sz w:val="18"/>
                 <w:szCs w:val="18"/>
               </w:rPr>
-              <w:t xml:space="preserve">18</w:t>
+              <w:t xml:space="preserve">16</w:t>
             </w:r>
           </w:p>
         </w:tc>
@@ -34162,7 +35829,7 @@
                 <w:sz w:val="18"/>
                 <w:szCs w:val="18"/>
               </w:rPr>
-              <w:t xml:space="preserve">94.9</w:t>
+              <w:t xml:space="preserve">93.6</w:t>
             </w:r>
           </w:p>
         </w:tc>
@@ -34230,7 +35897,7 @@
                 <w:sz w:val="18"/>
                 <w:szCs w:val="18"/>
               </w:rPr>
-              <w:t xml:space="preserve">45</w:t>
+              <w:t xml:space="preserve">44</w:t>
             </w:r>
           </w:p>
         </w:tc>
@@ -34405,7 +36072,7 @@
                 <w:sz w:val="18"/>
                 <w:szCs w:val="18"/>
               </w:rPr>
-              <w:t xml:space="preserve">14</w:t>
+              <w:t xml:space="preserve">12</w:t>
             </w:r>
           </w:p>
         </w:tc>
@@ -34473,7 +36140,7 @@
                 <w:sz w:val="18"/>
                 <w:szCs w:val="18"/>
               </w:rPr>
-              <w:t xml:space="preserve">20</w:t>
+              <w:t xml:space="preserve">19</w:t>
             </w:r>
           </w:p>
         </w:tc>
@@ -34541,7 +36208,7 @@
                 <w:sz w:val="18"/>
                 <w:szCs w:val="18"/>
               </w:rPr>
-              <w:t xml:space="preserve">80.8</w:t>
+              <w:t xml:space="preserve">78.2</w:t>
             </w:r>
           </w:p>
         </w:tc>
@@ -34609,7 +36276,7 @@
                 <w:sz w:val="18"/>
                 <w:szCs w:val="18"/>
               </w:rPr>
-              <w:t xml:space="preserve">28</w:t>
+              <w:t xml:space="preserve">25</w:t>
             </w:r>
           </w:p>
         </w:tc>
@@ -34677,7 +36344,7 @@
                 <w:sz w:val="18"/>
                 <w:szCs w:val="18"/>
               </w:rPr>
-              <w:t xml:space="preserve">5</w:t>
+              <w:t xml:space="preserve">4</w:t>
             </w:r>
           </w:p>
         </w:tc>
@@ -34784,7 +36451,7 @@
                 <w:sz w:val="18"/>
                 <w:szCs w:val="18"/>
               </w:rPr>
-              <w:t xml:space="preserve">15.73</w:t>
+              <w:t xml:space="preserve">14.80</w:t>
             </w:r>
           </w:p>
         </w:tc>
@@ -34852,7 +36519,7 @@
                 <w:sz w:val="18"/>
                 <w:szCs w:val="18"/>
               </w:rPr>
-              <w:t xml:space="preserve">18.73</w:t>
+              <w:t xml:space="preserve">17.47</w:t>
             </w:r>
           </w:p>
         </w:tc>
@@ -34920,7 +36587,7 @@
                 <w:sz w:val="18"/>
                 <w:szCs w:val="18"/>
               </w:rPr>
-              <w:t xml:space="preserve">85.90</w:t>
+              <w:t xml:space="preserve">83.42</w:t>
             </w:r>
           </w:p>
         </w:tc>
@@ -34988,7 +36655,7 @@
                 <w:sz w:val="18"/>
                 <w:szCs w:val="18"/>
               </w:rPr>
-              <w:t xml:space="preserve">35.27</w:t>
+              <w:t xml:space="preserve">32.67</w:t>
             </w:r>
           </w:p>
         </w:tc>
@@ -35056,7 +36723,7 @@
                 <w:sz w:val="18"/>
                 <w:szCs w:val="18"/>
               </w:rPr>
-              <w:t xml:space="preserve">5.67</w:t>
+              <w:t xml:space="preserve">5.27</w:t>
             </w:r>
           </w:p>
         </w:tc>
@@ -35099,7 +36766,7 @@
         <w:jc w:val="both"/>
       </w:pPr>
       <w:r>
-        <w:t xml:space="preserve">As shown in Table 4, the overall reading proficiency of the learners rose from a mean of 51.59 percent in the pre-test to 70.92 percent in the post-test, although both fall within the Developing level. The largest gains were in letter-sound knowledge, which moved from Developing (56.7%) to Approaching Proficiency (78.7%), and in word recognition, which moved from Beginning (40.2%) to Developing (62.4%). Reading accuracy increased from 75.47 to 85.90 percent and reading rate from 23.07 to 35.27 words correct per minute, but mean accuracy remained within the frustration level. Comprehension improved from 34.0 to 56.7 percent yet also stayed at the frustration level on average, which suggests that comprehension develops more slowly than word-level skills and needs continued support.</w:t>
+        <w:t xml:space="preserve">As shown in Table 5, the overall reading proficiency of the learners rose from a mean of 51.59 percent in the pre-test to 67.08 percent in the post-test, both within the Developing level. Letter-sound knowledge rose from 56.7 to 74.0 percent, close to the Approaching Proficiency threshold, and word recognition moved from the Beginning level (40.2 percent) to the Developing level (58.2 percent). Reading accuracy increased from 75.47 to 83.42 percent and reading rate from 23.07 to 32.67 words correct per minute, but mean accuracy remained within the frustration level. Comprehension improved from 34.0 to 52.7 percent yet also stayed at the frustration level on average, which suggests that comprehension develops more slowly than word-level skills and needs continued support. The larger standard deviations in the post-test show that the learners responded to the intervention at different rates.</w:t>
       </w:r>
     </w:p>
     <w:p>
@@ -35113,7 +36780,7 @@
           <w:b/>
           <w:bCs/>
         </w:rPr>
-        <w:t xml:space="preserve">Table 4. </w:t>
+        <w:t xml:space="preserve">Table 5. </w:t>
       </w:r>
       <w:r>
         <w:rPr>
@@ -35597,7 +37264,7 @@
                 <w:sz w:val="18"/>
                 <w:szCs w:val="18"/>
               </w:rPr>
-              <w:t xml:space="preserve">15.73 (3.63)</w:t>
+              <w:t xml:space="preserve">14.80 (4.16)</w:t>
             </w:r>
           </w:p>
         </w:tc>
@@ -35631,7 +37298,7 @@
                 <w:sz w:val="18"/>
                 <w:szCs w:val="18"/>
               </w:rPr>
-              <w:t xml:space="preserve">78.7</w:t>
+              <w:t xml:space="preserve">74.0</w:t>
             </w:r>
           </w:p>
         </w:tc>
@@ -35665,7 +37332,7 @@
                 <w:sz w:val="18"/>
                 <w:szCs w:val="18"/>
               </w:rPr>
-              <w:t xml:space="preserve">Approaching Proficiency</w:t>
+              <w:t xml:space="preserve">Developing</w:t>
             </w:r>
           </w:p>
         </w:tc>
@@ -35840,7 +37507,7 @@
                 <w:sz w:val="18"/>
                 <w:szCs w:val="18"/>
               </w:rPr>
-              <w:t xml:space="preserve">18.73 (5.73)</w:t>
+              <w:t xml:space="preserve">17.47 (6.33)</w:t>
             </w:r>
           </w:p>
         </w:tc>
@@ -35874,7 +37541,7 @@
                 <w:sz w:val="18"/>
                 <w:szCs w:val="18"/>
               </w:rPr>
-              <w:t xml:space="preserve">62.4</w:t>
+              <w:t xml:space="preserve">58.2</w:t>
             </w:r>
           </w:p>
         </w:tc>
@@ -36083,7 +37750,7 @@
                 <w:sz w:val="18"/>
                 <w:szCs w:val="18"/>
               </w:rPr>
-              <w:t xml:space="preserve">85.90 (9.63)</w:t>
+              <w:t xml:space="preserve">83.42 (10.39)</w:t>
             </w:r>
           </w:p>
         </w:tc>
@@ -36117,7 +37784,7 @@
                 <w:sz w:val="18"/>
                 <w:szCs w:val="18"/>
               </w:rPr>
-              <w:t xml:space="preserve">85.9</w:t>
+              <w:t xml:space="preserve">83.4</w:t>
             </w:r>
           </w:p>
         </w:tc>
@@ -36326,7 +37993,7 @@
                 <w:sz w:val="18"/>
                 <w:szCs w:val="18"/>
               </w:rPr>
-              <w:t xml:space="preserve">5.67 (2.19)</w:t>
+              <w:t xml:space="preserve">5.27 (2.34)</w:t>
             </w:r>
           </w:p>
         </w:tc>
@@ -36360,7 +38027,7 @@
                 <w:sz w:val="18"/>
                 <w:szCs w:val="18"/>
               </w:rPr>
-              <w:t xml:space="preserve">56.7</w:t>
+              <w:t xml:space="preserve">52.7</w:t>
             </w:r>
           </w:p>
         </w:tc>
@@ -36569,7 +38236,7 @@
                 <w:sz w:val="18"/>
                 <w:szCs w:val="18"/>
               </w:rPr>
-              <w:t xml:space="preserve">35.27 (12.13)</w:t>
+              <w:t xml:space="preserve">32.67 (12.48)</w:t>
             </w:r>
           </w:p>
         </w:tc>
@@ -36812,7 +38479,7 @@
                 <w:sz w:val="18"/>
                 <w:szCs w:val="18"/>
               </w:rPr>
-              <w:t xml:space="preserve">70.92 (16.38)</w:t>
+              <w:t xml:space="preserve">67.08 (17.71)</w:t>
             </w:r>
           </w:p>
         </w:tc>
@@ -36846,7 +38513,7 @@
                 <w:sz w:val="18"/>
                 <w:szCs w:val="18"/>
               </w:rPr>
-              <w:t xml:space="preserve">70.9</w:t>
+              <w:t xml:space="preserve">67.1</w:t>
             </w:r>
           </w:p>
         </w:tc>
@@ -36907,7 +38574,7 @@
         <w:jc w:val="both"/>
       </w:pPr>
       <w:r>
-        <w:t xml:space="preserve">Table 5 shows how the learners moved across proficiency levels. In the pre-test, all 15 learners (100%) read at the frustration level in accuracy and 14 (93.3%) were at the frustration level in comprehension. In the post-test, 7 learners (46.7%) reached the instructional level in accuracy, and 9 learners (60.0%) reached the instructional or independent level in comprehension. In letter-sound knowledge, 11 learners (73.3%) reached the Approaching Proficiency or Proficient level, compared with only 2 (13.3%) in the pre-test. However, learners L04, L07, and L09 remained at the Beginning level in word recognition and will need more intensive support, a finding that will be considered in the reading enhancement action plan.</w:t>
+        <w:t xml:space="preserve">Table 6 shows how the learners moved across proficiency levels. In the pre-test, all 15 learners (100%) read at the frustration level in accuracy and 14 (93.3%) were at the frustration level in comprehension. In the post-test, 6 learners (40.0%) reached the instructional level in accuracy, and 8 learners (53.3%) reached the instructional or independent level in comprehension. In letter-sound knowledge, 10 learners (66.7%) reached the Approaching Proficiency or Proficient level, compared with only 2 (13.3%) in the pre-test. Fourteen of the 15 learners improved their overall score. However, four learners remained at the Beginning level in word recognition; three of them, L04, L07, and L09, also made little or no progress in fluency and comprehension and will need more intensive support, a finding that will be considered in the reading enhancement action plan.</w:t>
       </w:r>
     </w:p>
     <w:p>
@@ -36921,7 +38588,7 @@
           <w:b/>
           <w:bCs/>
         </w:rPr>
-        <w:t xml:space="preserve">Table 5. </w:t>
+        <w:t xml:space="preserve">Table 6. </w:t>
       </w:r>
       <w:r>
         <w:rPr>
@@ -37546,7 +39213,7 @@
                 <w:sz w:val="18"/>
                 <w:szCs w:val="18"/>
               </w:rPr>
-              <w:t xml:space="preserve">6</w:t>
+              <w:t xml:space="preserve">5</w:t>
             </w:r>
           </w:p>
         </w:tc>
@@ -37580,7 +39247,7 @@
                 <w:sz w:val="18"/>
                 <w:szCs w:val="18"/>
               </w:rPr>
-              <w:t xml:space="preserve">40.0</w:t>
+              <w:t xml:space="preserve">33.3</w:t>
             </w:r>
           </w:p>
         </w:tc>
@@ -37755,7 +39422,7 @@
                 <w:sz w:val="18"/>
                 <w:szCs w:val="18"/>
               </w:rPr>
-              <w:t xml:space="preserve">2</w:t>
+              <w:t xml:space="preserve">3</w:t>
             </w:r>
           </w:p>
         </w:tc>
@@ -37789,7 +39456,7 @@
                 <w:sz w:val="18"/>
                 <w:szCs w:val="18"/>
               </w:rPr>
-              <w:t xml:space="preserve">13.3</w:t>
+              <w:t xml:space="preserve">20.0</w:t>
             </w:r>
           </w:p>
         </w:tc>
@@ -38382,7 +40049,7 @@
                 <w:sz w:val="18"/>
                 <w:szCs w:val="18"/>
               </w:rPr>
-              <w:t xml:space="preserve">6</w:t>
+              <w:t xml:space="preserve">5</w:t>
             </w:r>
           </w:p>
         </w:tc>
@@ -38416,7 +40083,7 @@
                 <w:sz w:val="18"/>
                 <w:szCs w:val="18"/>
               </w:rPr>
-              <w:t xml:space="preserve">40.0</w:t>
+              <w:t xml:space="preserve">33.3</w:t>
             </w:r>
           </w:p>
         </w:tc>
@@ -38800,7 +40467,7 @@
                 <w:sz w:val="18"/>
                 <w:szCs w:val="18"/>
               </w:rPr>
-              <w:t xml:space="preserve">3</w:t>
+              <w:t xml:space="preserve">4</w:t>
             </w:r>
           </w:p>
         </w:tc>
@@ -38834,7 +40501,7 @@
                 <w:sz w:val="18"/>
                 <w:szCs w:val="18"/>
               </w:rPr>
-              <w:t xml:space="preserve">20.0</w:t>
+              <w:t xml:space="preserve">26.7</w:t>
             </w:r>
           </w:p>
         </w:tc>
@@ -39218,7 +40885,7 @@
                 <w:sz w:val="18"/>
                 <w:szCs w:val="18"/>
               </w:rPr>
-              <w:t xml:space="preserve">7</w:t>
+              <w:t xml:space="preserve">6</w:t>
             </w:r>
           </w:p>
         </w:tc>
@@ -39252,7 +40919,7 @@
                 <w:sz w:val="18"/>
                 <w:szCs w:val="18"/>
               </w:rPr>
-              <w:t xml:space="preserve">46.7</w:t>
+              <w:t xml:space="preserve">40.0</w:t>
             </w:r>
           </w:p>
         </w:tc>
@@ -39427,7 +41094,7 @@
                 <w:sz w:val="18"/>
                 <w:szCs w:val="18"/>
               </w:rPr>
-              <w:t xml:space="preserve">8</w:t>
+              <w:t xml:space="preserve">9</w:t>
             </w:r>
           </w:p>
         </w:tc>
@@ -39461,7 +41128,7 @@
                 <w:sz w:val="18"/>
                 <w:szCs w:val="18"/>
               </w:rPr>
-              <w:t xml:space="preserve">53.3</w:t>
+              <w:t xml:space="preserve">60.0</w:t>
             </w:r>
           </w:p>
         </w:tc>
@@ -39636,7 +41303,7 @@
                 <w:sz w:val="18"/>
                 <w:szCs w:val="18"/>
               </w:rPr>
-              <w:t xml:space="preserve">4</w:t>
+              <w:t xml:space="preserve">3</w:t>
             </w:r>
           </w:p>
         </w:tc>
@@ -39670,7 +41337,7 @@
                 <w:sz w:val="18"/>
                 <w:szCs w:val="18"/>
               </w:rPr>
-              <w:t xml:space="preserve">26.7</w:t>
+              <w:t xml:space="preserve">20.0</w:t>
             </w:r>
           </w:p>
         </w:tc>
@@ -40054,7 +41721,7 @@
                 <w:sz w:val="18"/>
                 <w:szCs w:val="18"/>
               </w:rPr>
-              <w:t xml:space="preserve">6</w:t>
+              <w:t xml:space="preserve">7</w:t>
             </w:r>
           </w:p>
         </w:tc>
@@ -40088,7 +41755,7 @@
                 <w:sz w:val="18"/>
                 <w:szCs w:val="18"/>
               </w:rPr>
-              <w:t xml:space="preserve">40.0</w:t>
+              <w:t xml:space="preserve">46.7</w:t>
             </w:r>
           </w:p>
         </w:tc>
@@ -40131,7 +41798,7 @@
         <w:jc w:val="both"/>
       </w:pPr>
       <w:r>
-        <w:t xml:space="preserve">Before testing the difference, the normality of the difference scores was examined using the Shapiro–Wilk test. As shown in Table 6, the difference scores in all areas were normally distributed (p &gt; .05); hence, the paired-samples t-test was used.</w:t>
+        <w:t xml:space="preserve">Before testing the difference, the normality of the difference scores was examined using the Shapiro–Wilk test. As shown in Table 7, the difference scores in all areas were normally distributed (p &gt; .05); hence, the paired-samples t-test was used.</w:t>
       </w:r>
     </w:p>
     <w:p>
@@ -40145,7 +41812,7 @@
           <w:b/>
           <w:bCs/>
         </w:rPr>
-        <w:t xml:space="preserve">Table 6. </w:t>
+        <w:t xml:space="preserve">Table 7. </w:t>
       </w:r>
       <w:r>
         <w:rPr>
@@ -40423,7 +42090,7 @@
                 <w:sz w:val="18"/>
                 <w:szCs w:val="18"/>
               </w:rPr>
-              <w:t xml:space="preserve">0.940</w:t>
+              <w:t xml:space="preserve">.898</w:t>
             </w:r>
           </w:p>
         </w:tc>
@@ -40457,7 +42124,7 @@
                 <w:sz w:val="18"/>
                 <w:szCs w:val="18"/>
               </w:rPr>
-              <w:t xml:space="preserve">.378</w:t>
+              <w:t xml:space="preserve">.089</w:t>
             </w:r>
           </w:p>
         </w:tc>
@@ -40598,7 +42265,7 @@
                 <w:sz w:val="18"/>
                 <w:szCs w:val="18"/>
               </w:rPr>
-              <w:t xml:space="preserve">0.942</w:t>
+              <w:t xml:space="preserve">.920</w:t>
             </w:r>
           </w:p>
         </w:tc>
@@ -40632,7 +42299,7 @@
                 <w:sz w:val="18"/>
                 <w:szCs w:val="18"/>
               </w:rPr>
-              <w:t xml:space="preserve">.411</w:t>
+              <w:t xml:space="preserve">.193</w:t>
             </w:r>
           </w:p>
         </w:tc>
@@ -40773,7 +42440,7 @@
                 <w:sz w:val="18"/>
                 <w:szCs w:val="18"/>
               </w:rPr>
-              <w:t xml:space="preserve">0.946</w:t>
+              <w:t xml:space="preserve">.928</w:t>
             </w:r>
           </w:p>
         </w:tc>
@@ -40807,7 +42474,7 @@
                 <w:sz w:val="18"/>
                 <w:szCs w:val="18"/>
               </w:rPr>
-              <w:t xml:space="preserve">.467</w:t>
+              <w:t xml:space="preserve">.253</w:t>
             </w:r>
           </w:p>
         </w:tc>
@@ -40948,7 +42615,7 @@
                 <w:sz w:val="18"/>
                 <w:szCs w:val="18"/>
               </w:rPr>
-              <w:t xml:space="preserve">0.960</w:t>
+              <w:t xml:space="preserve">.924</w:t>
             </w:r>
           </w:p>
         </w:tc>
@@ -40982,7 +42649,7 @@
                 <w:sz w:val="18"/>
                 <w:szCs w:val="18"/>
               </w:rPr>
-              <w:t xml:space="preserve">.690</w:t>
+              <w:t xml:space="preserve">.218</w:t>
             </w:r>
           </w:p>
         </w:tc>
@@ -41123,7 +42790,7 @@
                 <w:sz w:val="18"/>
                 <w:szCs w:val="18"/>
               </w:rPr>
-              <w:t xml:space="preserve">0.941</w:t>
+              <w:t xml:space="preserve">.927</w:t>
             </w:r>
           </w:p>
         </w:tc>
@@ -41157,7 +42824,7 @@
                 <w:sz w:val="18"/>
                 <w:szCs w:val="18"/>
               </w:rPr>
-              <w:t xml:space="preserve">.401</w:t>
+              <w:t xml:space="preserve">.245</w:t>
             </w:r>
           </w:p>
         </w:tc>
@@ -41298,7 +42965,7 @@
                 <w:sz w:val="18"/>
                 <w:szCs w:val="18"/>
               </w:rPr>
-              <w:t xml:space="preserve">0.982</w:t>
+              <w:t xml:space="preserve">.968</w:t>
             </w:r>
           </w:p>
         </w:tc>
@@ -41332,7 +42999,7 @@
                 <w:sz w:val="18"/>
                 <w:szCs w:val="18"/>
               </w:rPr>
-              <w:t xml:space="preserve">.983</w:t>
+              <w:t xml:space="preserve">.820</w:t>
             </w:r>
           </w:p>
         </w:tc>
@@ -41418,7 +43085,7 @@
         <w:jc w:val="both"/>
       </w:pPr>
       <w:r>
-        <w:t xml:space="preserve">Table 7 shows that the post-test scores were significantly higher than the pre-test scores in all four reading areas, in reading rate, and in overall reading proficiency (p &lt; .001). The null hypothesis that there is no significant difference between the pre-test and post-test reading proficiency levels of the learners is therefore rejected. The effect sizes, ranging from d = 1.48 to d = 2.00, are large based on Cohen’s (1988) benchmarks, which indicates that the improvement was not only statistically significant but also substantial. Because the study uses a one-group design, these gains will be interpreted with caution, since factors other than the RIM, such as regular classroom instruction and maturation, may also have contributed to the improvement.</w:t>
+        <w:t xml:space="preserve">Table 8 shows that the post-test scores were significantly higher than the pre-test scores in all four reading areas, in reading rate, and in overall reading proficiency (p = .002 or lower), and none of the 95 percent confidence intervals of the mean differences includes zero. The null hypothesis that there is no significant difference between the pre-test and post-test reading proficiency levels of the learners is therefore rejected. The effect sizes, ranging from d = 1.01 to d = 1.26, are large based on Cohen’s (1988) benchmarks. As a robustness check, the Wilcoxon signed-rank test led to the same conclusions in all areas (z = 2.85 to 3.30, p = .004 or lower, r = .74 to .85). Because the study uses a one-group design and a small sample, these gains will be interpreted with caution, since factors other than the RIM, such as regular classroom instruction and maturation, may also have contributed to the improvement.</w:t>
       </w:r>
     </w:p>
     <w:p>
@@ -41432,7 +43099,7 @@
           <w:b/>
           <w:bCs/>
         </w:rPr>
-        <w:t xml:space="preserve">Table 7. </w:t>
+        <w:t xml:space="preserve">Table 8. </w:t>
       </w:r>
       <w:r>
         <w:rPr>
@@ -41456,14 +43123,13 @@
       </w:tblPr>
       <w:tblGrid>
         <w:gridCol w:w="1900"/>
-        <w:gridCol w:w="860"/>
-        <w:gridCol w:w="860"/>
-        <w:gridCol w:w="900"/>
-        <w:gridCol w:w="1100"/>
-        <w:gridCol w:w="760"/>
-        <w:gridCol w:w="900"/>
-        <w:gridCol w:w="880"/>
-        <w:gridCol w:w="1200"/>
+        <w:gridCol w:w="1150"/>
+        <w:gridCol w:w="1150"/>
+        <w:gridCol w:w="1250"/>
+        <w:gridCol w:w="1000"/>
+        <w:gridCol w:w="650"/>
+        <w:gridCol w:w="1180"/>
+        <w:gridCol w:w="1080"/>
       </w:tblGrid>
       <w:tr>
         <w:trPr>
@@ -41507,7 +43173,7 @@
         </w:tc>
         <w:tc>
           <w:tcPr>
-            <w:tcW w:type="dxa" w:w="860"/>
+            <w:tcW w:type="dxa" w:w="1150"/>
             <w:tcBorders>
               <w:top w:val="single" w:color="000000" w:sz="4"/>
               <w:left w:val="single" w:color="000000" w:sz="4"/>
@@ -41536,13 +43202,13 @@
                 <w:sz w:val="17"/>
                 <w:szCs w:val="17"/>
               </w:rPr>
-              <w:t xml:space="preserve">Pre-test Mean</w:t>
-            </w:r>
-          </w:p>
-        </w:tc>
-        <w:tc>
-          <w:tcPr>
-            <w:tcW w:type="dxa" w:w="860"/>
+              <w:t xml:space="preserve">Pre-test M (SD)</w:t>
+            </w:r>
+          </w:p>
+        </w:tc>
+        <w:tc>
+          <w:tcPr>
+            <w:tcW w:type="dxa" w:w="1150"/>
             <w:tcBorders>
               <w:top w:val="single" w:color="000000" w:sz="4"/>
               <w:left w:val="single" w:color="000000" w:sz="4"/>
@@ -41571,13 +43237,13 @@
                 <w:sz w:val="17"/>
                 <w:szCs w:val="17"/>
               </w:rPr>
-              <w:t xml:space="preserve">Post-test Mean</w:t>
-            </w:r>
-          </w:p>
-        </w:tc>
-        <w:tc>
-          <w:tcPr>
-            <w:tcW w:type="dxa" w:w="900"/>
+              <w:t xml:space="preserve">Post-test M (SD)</w:t>
+            </w:r>
+          </w:p>
+        </w:tc>
+        <w:tc>
+          <w:tcPr>
+            <w:tcW w:type="dxa" w:w="1250"/>
             <w:tcBorders>
               <w:top w:val="single" w:color="000000" w:sz="4"/>
               <w:left w:val="single" w:color="000000" w:sz="4"/>
@@ -41606,13 +43272,13 @@
                 <w:sz w:val="17"/>
                 <w:szCs w:val="17"/>
               </w:rPr>
-              <w:t xml:space="preserve">Mean Diff.</w:t>
-            </w:r>
-          </w:p>
-        </w:tc>
-        <w:tc>
-          <w:tcPr>
-            <w:tcW w:type="dxa" w:w="1100"/>
+              <w:t xml:space="preserve">Mean Diff. [95% CI]</w:t>
+            </w:r>
+          </w:p>
+        </w:tc>
+        <w:tc>
+          <w:tcPr>
+            <w:tcW w:type="dxa" w:w="1000"/>
             <w:tcBorders>
               <w:top w:val="single" w:color="000000" w:sz="4"/>
               <w:left w:val="single" w:color="000000" w:sz="4"/>
@@ -41647,7 +43313,7 @@
         </w:tc>
         <w:tc>
           <w:tcPr>
-            <w:tcW w:type="dxa" w:w="760"/>
+            <w:tcW w:type="dxa" w:w="650"/>
             <w:tcBorders>
               <w:top w:val="single" w:color="000000" w:sz="4"/>
               <w:left w:val="single" w:color="000000" w:sz="4"/>
@@ -41682,7 +43348,7 @@
         </w:tc>
         <w:tc>
           <w:tcPr>
-            <w:tcW w:type="dxa" w:w="900"/>
+            <w:tcW w:type="dxa" w:w="1180"/>
             <w:tcBorders>
               <w:top w:val="single" w:color="000000" w:sz="4"/>
               <w:left w:val="single" w:color="000000" w:sz="4"/>
@@ -41717,58 +43383,7 @@
         </w:tc>
         <w:tc>
           <w:tcPr>
-            <w:tcW w:type="dxa" w:w="880"/>
-            <w:tcBorders>
-              <w:top w:val="single" w:color="000000" w:sz="4"/>
-              <w:left w:val="single" w:color="000000" w:sz="4"/>
-              <w:bottom w:val="single" w:color="000000" w:sz="4"/>
-              <w:right w:val="single" w:color="000000" w:sz="4"/>
-            </w:tcBorders>
-            <w:shd w:fill="E7E6E6" w:color="auto" w:val="clear"/>
-            <w:tcMar>
-              <w:top w:type="dxa" w:w="40"/>
-              <w:left w:type="dxa" w:w="80"/>
-              <w:bottom w:type="dxa" w:w="40"/>
-              <w:right w:type="dxa" w:w="80"/>
-            </w:tcMar>
-            <w:vAlign w:val="center"/>
-          </w:tcPr>
-          <w:p>
-            <w:pPr>
-              <w:keepNext/>
-              <w:spacing w:after="0" w:line="240" w:lineRule="auto"/>
-              <w:jc w:val="center"/>
-            </w:pPr>
-            <w:r>
-              <w:rPr>
-                <w:b/>
-                <w:bCs/>
-                <w:sz w:val="17"/>
-                <w:szCs w:val="17"/>
-              </w:rPr>
-              <w:t xml:space="preserve">Magni-</w:t>
-            </w:r>
-          </w:p>
-          <w:p>
-            <w:pPr>
-              <w:keepNext/>
-              <w:spacing w:after="0" w:line="240" w:lineRule="auto"/>
-              <w:jc w:val="center"/>
-            </w:pPr>
-            <w:r>
-              <w:rPr>
-                <w:b/>
-                <w:bCs/>
-                <w:sz w:val="17"/>
-                <w:szCs w:val="17"/>
-              </w:rPr>
-              <w:t xml:space="preserve">tude</w:t>
-            </w:r>
-          </w:p>
-        </w:tc>
-        <w:tc>
-          <w:tcPr>
-            <w:tcW w:type="dxa" w:w="1200"/>
+            <w:tcW w:type="dxa" w:w="1080"/>
             <w:tcBorders>
               <w:top w:val="single" w:color="000000" w:sz="4"/>
               <w:left w:val="single" w:color="000000" w:sz="4"/>
@@ -41842,7 +43457,7 @@
         </w:tc>
         <w:tc>
           <w:tcPr>
-            <w:tcW w:type="dxa" w:w="860"/>
+            <w:tcW w:type="dxa" w:w="1150"/>
             <w:tcBorders>
               <w:top w:val="single" w:color="000000" w:sz="4"/>
               <w:left w:val="single" w:color="000000" w:sz="4"/>
@@ -41870,13 +43485,13 @@
                 <w:sz w:val="17"/>
                 <w:szCs w:val="17"/>
               </w:rPr>
-              <w:t xml:space="preserve">11.33</w:t>
-            </w:r>
-          </w:p>
-        </w:tc>
-        <w:tc>
-          <w:tcPr>
-            <w:tcW w:type="dxa" w:w="860"/>
+              <w:t xml:space="preserve">11.33 (2.58)</w:t>
+            </w:r>
+          </w:p>
+        </w:tc>
+        <w:tc>
+          <w:tcPr>
+            <w:tcW w:type="dxa" w:w="1150"/>
             <w:tcBorders>
               <w:top w:val="single" w:color="000000" w:sz="4"/>
               <w:left w:val="single" w:color="000000" w:sz="4"/>
@@ -41904,13 +43519,13 @@
                 <w:sz w:val="17"/>
                 <w:szCs w:val="17"/>
               </w:rPr>
-              <w:t xml:space="preserve">15.73</w:t>
-            </w:r>
-          </w:p>
-        </w:tc>
-        <w:tc>
-          <w:tcPr>
-            <w:tcW w:type="dxa" w:w="900"/>
+              <w:t xml:space="preserve">14.80 (4.16)</w:t>
+            </w:r>
+          </w:p>
+        </w:tc>
+        <w:tc>
+          <w:tcPr>
+            <w:tcW w:type="dxa" w:w="1250"/>
             <w:tcBorders>
               <w:top w:val="single" w:color="000000" w:sz="4"/>
               <w:left w:val="single" w:color="000000" w:sz="4"/>
@@ -41938,27 +43553,9 @@
                 <w:sz w:val="17"/>
                 <w:szCs w:val="17"/>
               </w:rPr>
-              <w:t xml:space="preserve">4.40</w:t>
-            </w:r>
-          </w:p>
-        </w:tc>
-        <w:tc>
-          <w:tcPr>
-            <w:tcW w:type="dxa" w:w="1100"/>
-            <w:tcBorders>
-              <w:top w:val="single" w:color="000000" w:sz="4"/>
-              <w:left w:val="single" w:color="000000" w:sz="4"/>
-              <w:bottom w:val="single" w:color="000000" w:sz="4"/>
-              <w:right w:val="single" w:color="000000" w:sz="4"/>
-            </w:tcBorders>
-            <w:tcMar>
-              <w:top w:type="dxa" w:w="40"/>
-              <w:left w:type="dxa" w:w="80"/>
-              <w:bottom w:type="dxa" w:w="40"/>
-              <w:right w:type="dxa" w:w="80"/>
-            </w:tcMar>
-            <w:vAlign w:val="center"/>
-          </w:tcPr>
+              <w:t xml:space="preserve">3.47</w:t>
+            </w:r>
+          </w:p>
           <w:p>
             <w:pPr>
               <w:keepNext/>
@@ -41972,13 +43569,13 @@
                 <w:sz w:val="17"/>
                 <w:szCs w:val="17"/>
               </w:rPr>
-              <w:t xml:space="preserve">t(14) = 7.76</w:t>
-            </w:r>
-          </w:p>
-        </w:tc>
-        <w:tc>
-          <w:tcPr>
-            <w:tcW w:type="dxa" w:w="760"/>
+              <w:t xml:space="preserve">[1.78, 5.15]</w:t>
+            </w:r>
+          </w:p>
+        </w:tc>
+        <w:tc>
+          <w:tcPr>
+            <w:tcW w:type="dxa" w:w="1000"/>
             <w:tcBorders>
               <w:top w:val="single" w:color="000000" w:sz="4"/>
               <w:left w:val="single" w:color="000000" w:sz="4"/>
@@ -42006,13 +43603,13 @@
                 <w:sz w:val="17"/>
                 <w:szCs w:val="17"/>
               </w:rPr>
-              <w:t xml:space="preserve">&lt; .001</w:t>
-            </w:r>
-          </w:p>
-        </w:tc>
-        <w:tc>
-          <w:tcPr>
-            <w:tcW w:type="dxa" w:w="900"/>
+              <w:t xml:space="preserve">t(14) = 4.41</w:t>
+            </w:r>
+          </w:p>
+        </w:tc>
+        <w:tc>
+          <w:tcPr>
+            <w:tcW w:type="dxa" w:w="650"/>
             <w:tcBorders>
               <w:top w:val="single" w:color="000000" w:sz="4"/>
               <w:left w:val="single" w:color="000000" w:sz="4"/>
@@ -42040,13 +43637,13 @@
                 <w:sz w:val="17"/>
                 <w:szCs w:val="17"/>
               </w:rPr>
-              <w:t xml:space="preserve">d = 2.00</w:t>
-            </w:r>
-          </w:p>
-        </w:tc>
-        <w:tc>
-          <w:tcPr>
-            <w:tcW w:type="dxa" w:w="880"/>
+              <w:t xml:space="preserve">&lt; .001</w:t>
+            </w:r>
+          </w:p>
+        </w:tc>
+        <w:tc>
+          <w:tcPr>
+            <w:tcW w:type="dxa" w:w="1180"/>
             <w:tcBorders>
               <w:top w:val="single" w:color="000000" w:sz="4"/>
               <w:left w:val="single" w:color="000000" w:sz="4"/>
@@ -42074,13 +43671,13 @@
                 <w:sz w:val="17"/>
                 <w:szCs w:val="17"/>
               </w:rPr>
-              <w:t xml:space="preserve">Large</w:t>
-            </w:r>
-          </w:p>
-        </w:tc>
-        <w:tc>
-          <w:tcPr>
-            <w:tcW w:type="dxa" w:w="1200"/>
+              <w:t xml:space="preserve">d = 1.14 (Large)</w:t>
+            </w:r>
+          </w:p>
+        </w:tc>
+        <w:tc>
+          <w:tcPr>
+            <w:tcW w:type="dxa" w:w="1080"/>
             <w:tcBorders>
               <w:top w:val="single" w:color="000000" w:sz="4"/>
               <w:left w:val="single" w:color="000000" w:sz="4"/>
@@ -42108,7 +43705,7 @@
                 <w:sz w:val="17"/>
                 <w:szCs w:val="17"/>
               </w:rPr>
-              <w:t xml:space="preserve">Reject Ho; Significant</w:t>
+              <w:t xml:space="preserve">Reject Ho</w:t>
             </w:r>
           </w:p>
         </w:tc>
@@ -42153,7 +43750,7 @@
         </w:tc>
         <w:tc>
           <w:tcPr>
-            <w:tcW w:type="dxa" w:w="860"/>
+            <w:tcW w:type="dxa" w:w="1150"/>
             <w:tcBorders>
               <w:top w:val="single" w:color="000000" w:sz="4"/>
               <w:left w:val="single" w:color="000000" w:sz="4"/>
@@ -42181,13 +43778,13 @@
                 <w:sz w:val="17"/>
                 <w:szCs w:val="17"/>
               </w:rPr>
-              <w:t xml:space="preserve">12.07</w:t>
-            </w:r>
-          </w:p>
-        </w:tc>
-        <w:tc>
-          <w:tcPr>
-            <w:tcW w:type="dxa" w:w="860"/>
+              <w:t xml:space="preserve">12.07 (3.84)</w:t>
+            </w:r>
+          </w:p>
+        </w:tc>
+        <w:tc>
+          <w:tcPr>
+            <w:tcW w:type="dxa" w:w="1150"/>
             <w:tcBorders>
               <w:top w:val="single" w:color="000000" w:sz="4"/>
               <w:left w:val="single" w:color="000000" w:sz="4"/>
@@ -42215,13 +43812,13 @@
                 <w:sz w:val="17"/>
                 <w:szCs w:val="17"/>
               </w:rPr>
-              <w:t xml:space="preserve">18.73</w:t>
-            </w:r>
-          </w:p>
-        </w:tc>
-        <w:tc>
-          <w:tcPr>
-            <w:tcW w:type="dxa" w:w="900"/>
+              <w:t xml:space="preserve">17.47 (6.33)</w:t>
+            </w:r>
+          </w:p>
+        </w:tc>
+        <w:tc>
+          <w:tcPr>
+            <w:tcW w:type="dxa" w:w="1250"/>
             <w:tcBorders>
               <w:top w:val="single" w:color="000000" w:sz="4"/>
               <w:left w:val="single" w:color="000000" w:sz="4"/>
@@ -42249,27 +43846,9 @@
                 <w:sz w:val="17"/>
                 <w:szCs w:val="17"/>
               </w:rPr>
-              <w:t xml:space="preserve">6.67</w:t>
-            </w:r>
-          </w:p>
-        </w:tc>
-        <w:tc>
-          <w:tcPr>
-            <w:tcW w:type="dxa" w:w="1100"/>
-            <w:tcBorders>
-              <w:top w:val="single" w:color="000000" w:sz="4"/>
-              <w:left w:val="single" w:color="000000" w:sz="4"/>
-              <w:bottom w:val="single" w:color="000000" w:sz="4"/>
-              <w:right w:val="single" w:color="000000" w:sz="4"/>
-            </w:tcBorders>
-            <w:tcMar>
-              <w:top w:type="dxa" w:w="40"/>
-              <w:left w:type="dxa" w:w="80"/>
-              <w:bottom w:type="dxa" w:w="40"/>
-              <w:right w:type="dxa" w:w="80"/>
-            </w:tcMar>
-            <w:vAlign w:val="center"/>
-          </w:tcPr>
+              <w:t xml:space="preserve">5.40</w:t>
+            </w:r>
+          </w:p>
           <w:p>
             <w:pPr>
               <w:keepNext/>
@@ -42283,13 +43862,13 @@
                 <w:sz w:val="17"/>
                 <w:szCs w:val="17"/>
               </w:rPr>
-              <w:t xml:space="preserve">t(14) = 6.68</w:t>
-            </w:r>
-          </w:p>
-        </w:tc>
-        <w:tc>
-          <w:tcPr>
-            <w:tcW w:type="dxa" w:w="760"/>
+              <w:t xml:space="preserve">[2.80, 8.00]</w:t>
+            </w:r>
+          </w:p>
+        </w:tc>
+        <w:tc>
+          <w:tcPr>
+            <w:tcW w:type="dxa" w:w="1000"/>
             <w:tcBorders>
               <w:top w:val="single" w:color="000000" w:sz="4"/>
               <w:left w:val="single" w:color="000000" w:sz="4"/>
@@ -42317,13 +43896,13 @@
                 <w:sz w:val="17"/>
                 <w:szCs w:val="17"/>
               </w:rPr>
-              <w:t xml:space="preserve">&lt; .001</w:t>
-            </w:r>
-          </w:p>
-        </w:tc>
-        <w:tc>
-          <w:tcPr>
-            <w:tcW w:type="dxa" w:w="900"/>
+              <w:t xml:space="preserve">t(14) = 4.45</w:t>
+            </w:r>
+          </w:p>
+        </w:tc>
+        <w:tc>
+          <w:tcPr>
+            <w:tcW w:type="dxa" w:w="650"/>
             <w:tcBorders>
               <w:top w:val="single" w:color="000000" w:sz="4"/>
               <w:left w:val="single" w:color="000000" w:sz="4"/>
@@ -42351,13 +43930,13 @@
                 <w:sz w:val="17"/>
                 <w:szCs w:val="17"/>
               </w:rPr>
-              <w:t xml:space="preserve">d = 1.72</w:t>
-            </w:r>
-          </w:p>
-        </w:tc>
-        <w:tc>
-          <w:tcPr>
-            <w:tcW w:type="dxa" w:w="880"/>
+              <w:t xml:space="preserve">&lt; .001</w:t>
+            </w:r>
+          </w:p>
+        </w:tc>
+        <w:tc>
+          <w:tcPr>
+            <w:tcW w:type="dxa" w:w="1180"/>
             <w:tcBorders>
               <w:top w:val="single" w:color="000000" w:sz="4"/>
               <w:left w:val="single" w:color="000000" w:sz="4"/>
@@ -42385,13 +43964,13 @@
                 <w:sz w:val="17"/>
                 <w:szCs w:val="17"/>
               </w:rPr>
-              <w:t xml:space="preserve">Large</w:t>
-            </w:r>
-          </w:p>
-        </w:tc>
-        <w:tc>
-          <w:tcPr>
-            <w:tcW w:type="dxa" w:w="1200"/>
+              <w:t xml:space="preserve">d = 1.15 (Large)</w:t>
+            </w:r>
+          </w:p>
+        </w:tc>
+        <w:tc>
+          <w:tcPr>
+            <w:tcW w:type="dxa" w:w="1080"/>
             <w:tcBorders>
               <w:top w:val="single" w:color="000000" w:sz="4"/>
               <w:left w:val="single" w:color="000000" w:sz="4"/>
@@ -42419,7 +43998,7 @@
                 <w:sz w:val="17"/>
                 <w:szCs w:val="17"/>
               </w:rPr>
-              <w:t xml:space="preserve">Reject Ho; Significant</w:t>
+              <w:t xml:space="preserve">Reject Ho</w:t>
             </w:r>
           </w:p>
         </w:tc>
@@ -42464,7 +44043,7 @@
         </w:tc>
         <w:tc>
           <w:tcPr>
-            <w:tcW w:type="dxa" w:w="860"/>
+            <w:tcW w:type="dxa" w:w="1150"/>
             <w:tcBorders>
               <w:top w:val="single" w:color="000000" w:sz="4"/>
               <w:left w:val="single" w:color="000000" w:sz="4"/>
@@ -42492,13 +44071,13 @@
                 <w:sz w:val="17"/>
                 <w:szCs w:val="17"/>
               </w:rPr>
-              <w:t xml:space="preserve">75.47</w:t>
-            </w:r>
-          </w:p>
-        </w:tc>
-        <w:tc>
-          <w:tcPr>
-            <w:tcW w:type="dxa" w:w="860"/>
+              <w:t xml:space="preserve">75.47 (6.41)</w:t>
+            </w:r>
+          </w:p>
+        </w:tc>
+        <w:tc>
+          <w:tcPr>
+            <w:tcW w:type="dxa" w:w="1150"/>
             <w:tcBorders>
               <w:top w:val="single" w:color="000000" w:sz="4"/>
               <w:left w:val="single" w:color="000000" w:sz="4"/>
@@ -42526,13 +44105,13 @@
                 <w:sz w:val="17"/>
                 <w:szCs w:val="17"/>
               </w:rPr>
-              <w:t xml:space="preserve">85.90</w:t>
-            </w:r>
-          </w:p>
-        </w:tc>
-        <w:tc>
-          <w:tcPr>
-            <w:tcW w:type="dxa" w:w="900"/>
+              <w:t xml:space="preserve">83.42 (10.39)</w:t>
+            </w:r>
+          </w:p>
+        </w:tc>
+        <w:tc>
+          <w:tcPr>
+            <w:tcW w:type="dxa" w:w="1250"/>
             <w:tcBorders>
               <w:top w:val="single" w:color="000000" w:sz="4"/>
               <w:left w:val="single" w:color="000000" w:sz="4"/>
@@ -42560,27 +44139,9 @@
                 <w:sz w:val="17"/>
                 <w:szCs w:val="17"/>
               </w:rPr>
-              <w:t xml:space="preserve">10.43</w:t>
-            </w:r>
-          </w:p>
-        </w:tc>
-        <w:tc>
-          <w:tcPr>
-            <w:tcW w:type="dxa" w:w="1100"/>
-            <w:tcBorders>
-              <w:top w:val="single" w:color="000000" w:sz="4"/>
-              <w:left w:val="single" w:color="000000" w:sz="4"/>
-              <w:bottom w:val="single" w:color="000000" w:sz="4"/>
-              <w:right w:val="single" w:color="000000" w:sz="4"/>
-            </w:tcBorders>
-            <w:tcMar>
-              <w:top w:type="dxa" w:w="40"/>
-              <w:left w:type="dxa" w:w="80"/>
-              <w:bottom w:type="dxa" w:w="40"/>
-              <w:right w:type="dxa" w:w="80"/>
-            </w:tcMar>
-            <w:vAlign w:val="center"/>
-          </w:tcPr>
+              <w:t xml:space="preserve">7.95</w:t>
+            </w:r>
+          </w:p>
           <w:p>
             <w:pPr>
               <w:keepNext/>
@@ -42594,13 +44155,13 @@
                 <w:sz w:val="17"/>
                 <w:szCs w:val="17"/>
               </w:rPr>
-              <w:t xml:space="preserve">t(14) = 7.55</w:t>
-            </w:r>
-          </w:p>
-        </w:tc>
-        <w:tc>
-          <w:tcPr>
-            <w:tcW w:type="dxa" w:w="760"/>
+              <w:t xml:space="preserve">[4.43, 11.47]</w:t>
+            </w:r>
+          </w:p>
+        </w:tc>
+        <w:tc>
+          <w:tcPr>
+            <w:tcW w:type="dxa" w:w="1000"/>
             <w:tcBorders>
               <w:top w:val="single" w:color="000000" w:sz="4"/>
               <w:left w:val="single" w:color="000000" w:sz="4"/>
@@ -42628,13 +44189,13 @@
                 <w:sz w:val="17"/>
                 <w:szCs w:val="17"/>
               </w:rPr>
-              <w:t xml:space="preserve">&lt; .001</w:t>
-            </w:r>
-          </w:p>
-        </w:tc>
-        <w:tc>
-          <w:tcPr>
-            <w:tcW w:type="dxa" w:w="900"/>
+              <w:t xml:space="preserve">t(14) = 4.84</w:t>
+            </w:r>
+          </w:p>
+        </w:tc>
+        <w:tc>
+          <w:tcPr>
+            <w:tcW w:type="dxa" w:w="650"/>
             <w:tcBorders>
               <w:top w:val="single" w:color="000000" w:sz="4"/>
               <w:left w:val="single" w:color="000000" w:sz="4"/>
@@ -42662,13 +44223,13 @@
                 <w:sz w:val="17"/>
                 <w:szCs w:val="17"/>
               </w:rPr>
-              <w:t xml:space="preserve">d = 1.95</w:t>
-            </w:r>
-          </w:p>
-        </w:tc>
-        <w:tc>
-          <w:tcPr>
-            <w:tcW w:type="dxa" w:w="880"/>
+              <w:t xml:space="preserve">&lt; .001</w:t>
+            </w:r>
+          </w:p>
+        </w:tc>
+        <w:tc>
+          <w:tcPr>
+            <w:tcW w:type="dxa" w:w="1180"/>
             <w:tcBorders>
               <w:top w:val="single" w:color="000000" w:sz="4"/>
               <w:left w:val="single" w:color="000000" w:sz="4"/>
@@ -42696,13 +44257,13 @@
                 <w:sz w:val="17"/>
                 <w:szCs w:val="17"/>
               </w:rPr>
-              <w:t xml:space="preserve">Large</w:t>
-            </w:r>
-          </w:p>
-        </w:tc>
-        <w:tc>
-          <w:tcPr>
-            <w:tcW w:type="dxa" w:w="1200"/>
+              <w:t xml:space="preserve">d = 1.25 (Large)</w:t>
+            </w:r>
+          </w:p>
+        </w:tc>
+        <w:tc>
+          <w:tcPr>
+            <w:tcW w:type="dxa" w:w="1080"/>
             <w:tcBorders>
               <w:top w:val="single" w:color="000000" w:sz="4"/>
               <w:left w:val="single" w:color="000000" w:sz="4"/>
@@ -42730,7 +44291,7 @@
                 <w:sz w:val="17"/>
                 <w:szCs w:val="17"/>
               </w:rPr>
-              <w:t xml:space="preserve">Reject Ho; Significant</w:t>
+              <w:t xml:space="preserve">Reject Ho</w:t>
             </w:r>
           </w:p>
         </w:tc>
@@ -42775,7 +44336,7 @@
         </w:tc>
         <w:tc>
           <w:tcPr>
-            <w:tcW w:type="dxa" w:w="860"/>
+            <w:tcW w:type="dxa" w:w="1150"/>
             <w:tcBorders>
               <w:top w:val="single" w:color="000000" w:sz="4"/>
               <w:left w:val="single" w:color="000000" w:sz="4"/>
@@ -42803,13 +44364,13 @@
                 <w:sz w:val="17"/>
                 <w:szCs w:val="17"/>
               </w:rPr>
-              <w:t xml:space="preserve">23.07</w:t>
-            </w:r>
-          </w:p>
-        </w:tc>
-        <w:tc>
-          <w:tcPr>
-            <w:tcW w:type="dxa" w:w="860"/>
+              <w:t xml:space="preserve">23.07 (7.48)</w:t>
+            </w:r>
+          </w:p>
+        </w:tc>
+        <w:tc>
+          <w:tcPr>
+            <w:tcW w:type="dxa" w:w="1150"/>
             <w:tcBorders>
               <w:top w:val="single" w:color="000000" w:sz="4"/>
               <w:left w:val="single" w:color="000000" w:sz="4"/>
@@ -42837,13 +44398,13 @@
                 <w:sz w:val="17"/>
                 <w:szCs w:val="17"/>
               </w:rPr>
-              <w:t xml:space="preserve">35.27</w:t>
-            </w:r>
-          </w:p>
-        </w:tc>
-        <w:tc>
-          <w:tcPr>
-            <w:tcW w:type="dxa" w:w="900"/>
+              <w:t xml:space="preserve">32.67 (12.48)</w:t>
+            </w:r>
+          </w:p>
+        </w:tc>
+        <w:tc>
+          <w:tcPr>
+            <w:tcW w:type="dxa" w:w="1250"/>
             <w:tcBorders>
               <w:top w:val="single" w:color="000000" w:sz="4"/>
               <w:left w:val="single" w:color="000000" w:sz="4"/>
@@ -42871,27 +44432,9 @@
                 <w:sz w:val="17"/>
                 <w:szCs w:val="17"/>
               </w:rPr>
-              <w:t xml:space="preserve">12.20</w:t>
-            </w:r>
-          </w:p>
-        </w:tc>
-        <w:tc>
-          <w:tcPr>
-            <w:tcW w:type="dxa" w:w="1100"/>
-            <w:tcBorders>
-              <w:top w:val="single" w:color="000000" w:sz="4"/>
-              <w:left w:val="single" w:color="000000" w:sz="4"/>
-              <w:bottom w:val="single" w:color="000000" w:sz="4"/>
-              <w:right w:val="single" w:color="000000" w:sz="4"/>
-            </w:tcBorders>
-            <w:tcMar>
-              <w:top w:type="dxa" w:w="40"/>
-              <w:left w:type="dxa" w:w="80"/>
-              <w:bottom w:type="dxa" w:w="40"/>
-              <w:right w:type="dxa" w:w="80"/>
-            </w:tcMar>
-            <w:vAlign w:val="center"/>
-          </w:tcPr>
+              <w:t xml:space="preserve">9.60</w:t>
+            </w:r>
+          </w:p>
           <w:p>
             <w:pPr>
               <w:keepNext/>
@@ -42905,13 +44448,13 @@
                 <w:sz w:val="17"/>
                 <w:szCs w:val="17"/>
               </w:rPr>
-              <w:t xml:space="preserve">t(14) = 6.94</w:t>
-            </w:r>
-          </w:p>
-        </w:tc>
-        <w:tc>
-          <w:tcPr>
-            <w:tcW w:type="dxa" w:w="760"/>
+              <w:t xml:space="preserve">[5.30, 13.90]</w:t>
+            </w:r>
+          </w:p>
+        </w:tc>
+        <w:tc>
+          <w:tcPr>
+            <w:tcW w:type="dxa" w:w="1000"/>
             <w:tcBorders>
               <w:top w:val="single" w:color="000000" w:sz="4"/>
               <w:left w:val="single" w:color="000000" w:sz="4"/>
@@ -42939,13 +44482,13 @@
                 <w:sz w:val="17"/>
                 <w:szCs w:val="17"/>
               </w:rPr>
-              <w:t xml:space="preserve">&lt; .001</w:t>
-            </w:r>
-          </w:p>
-        </w:tc>
-        <w:tc>
-          <w:tcPr>
-            <w:tcW w:type="dxa" w:w="900"/>
+              <w:t xml:space="preserve">t(14) = 4.78</w:t>
+            </w:r>
+          </w:p>
+        </w:tc>
+        <w:tc>
+          <w:tcPr>
+            <w:tcW w:type="dxa" w:w="650"/>
             <w:tcBorders>
               <w:top w:val="single" w:color="000000" w:sz="4"/>
               <w:left w:val="single" w:color="000000" w:sz="4"/>
@@ -42973,13 +44516,13 @@
                 <w:sz w:val="17"/>
                 <w:szCs w:val="17"/>
               </w:rPr>
-              <w:t xml:space="preserve">d = 1.79</w:t>
-            </w:r>
-          </w:p>
-        </w:tc>
-        <w:tc>
-          <w:tcPr>
-            <w:tcW w:type="dxa" w:w="880"/>
+              <w:t xml:space="preserve">&lt; .001</w:t>
+            </w:r>
+          </w:p>
+        </w:tc>
+        <w:tc>
+          <w:tcPr>
+            <w:tcW w:type="dxa" w:w="1180"/>
             <w:tcBorders>
               <w:top w:val="single" w:color="000000" w:sz="4"/>
               <w:left w:val="single" w:color="000000" w:sz="4"/>
@@ -43007,13 +44550,13 @@
                 <w:sz w:val="17"/>
                 <w:szCs w:val="17"/>
               </w:rPr>
-              <w:t xml:space="preserve">Large</w:t>
-            </w:r>
-          </w:p>
-        </w:tc>
-        <w:tc>
-          <w:tcPr>
-            <w:tcW w:type="dxa" w:w="1200"/>
+              <w:t xml:space="preserve">d = 1.24 (Large)</w:t>
+            </w:r>
+          </w:p>
+        </w:tc>
+        <w:tc>
+          <w:tcPr>
+            <w:tcW w:type="dxa" w:w="1080"/>
             <w:tcBorders>
               <w:top w:val="single" w:color="000000" w:sz="4"/>
               <w:left w:val="single" w:color="000000" w:sz="4"/>
@@ -43041,7 +44584,7 @@
                 <w:sz w:val="17"/>
                 <w:szCs w:val="17"/>
               </w:rPr>
-              <w:t xml:space="preserve">Reject Ho; Significant</w:t>
+              <w:t xml:space="preserve">Reject Ho</w:t>
             </w:r>
           </w:p>
         </w:tc>
@@ -43086,7 +44629,7 @@
         </w:tc>
         <w:tc>
           <w:tcPr>
-            <w:tcW w:type="dxa" w:w="860"/>
+            <w:tcW w:type="dxa" w:w="1150"/>
             <w:tcBorders>
               <w:top w:val="single" w:color="000000" w:sz="4"/>
               <w:left w:val="single" w:color="000000" w:sz="4"/>
@@ -43114,13 +44657,13 @@
                 <w:sz w:val="17"/>
                 <w:szCs w:val="17"/>
               </w:rPr>
-              <w:t xml:space="preserve">3.40</w:t>
-            </w:r>
-          </w:p>
-        </w:tc>
-        <w:tc>
-          <w:tcPr>
-            <w:tcW w:type="dxa" w:w="860"/>
+              <w:t xml:space="preserve">3.40 (1.24)</w:t>
+            </w:r>
+          </w:p>
+        </w:tc>
+        <w:tc>
+          <w:tcPr>
+            <w:tcW w:type="dxa" w:w="1150"/>
             <w:tcBorders>
               <w:top w:val="single" w:color="000000" w:sz="4"/>
               <w:left w:val="single" w:color="000000" w:sz="4"/>
@@ -43148,13 +44691,13 @@
                 <w:sz w:val="17"/>
                 <w:szCs w:val="17"/>
               </w:rPr>
-              <w:t xml:space="preserve">5.67</w:t>
-            </w:r>
-          </w:p>
-        </w:tc>
-        <w:tc>
-          <w:tcPr>
-            <w:tcW w:type="dxa" w:w="900"/>
+              <w:t xml:space="preserve">5.27 (2.34)</w:t>
+            </w:r>
+          </w:p>
+        </w:tc>
+        <w:tc>
+          <w:tcPr>
+            <w:tcW w:type="dxa" w:w="1250"/>
             <w:tcBorders>
               <w:top w:val="single" w:color="000000" w:sz="4"/>
               <w:left w:val="single" w:color="000000" w:sz="4"/>
@@ -43182,27 +44725,9 @@
                 <w:sz w:val="17"/>
                 <w:szCs w:val="17"/>
               </w:rPr>
-              <w:t xml:space="preserve">2.27</w:t>
-            </w:r>
-          </w:p>
-        </w:tc>
-        <w:tc>
-          <w:tcPr>
-            <w:tcW w:type="dxa" w:w="1100"/>
-            <w:tcBorders>
-              <w:top w:val="single" w:color="000000" w:sz="4"/>
-              <w:left w:val="single" w:color="000000" w:sz="4"/>
-              <w:bottom w:val="single" w:color="000000" w:sz="4"/>
-              <w:right w:val="single" w:color="000000" w:sz="4"/>
-            </w:tcBorders>
-            <w:tcMar>
-              <w:top w:type="dxa" w:w="40"/>
-              <w:left w:type="dxa" w:w="80"/>
-              <w:bottom w:type="dxa" w:w="40"/>
-              <w:right w:type="dxa" w:w="80"/>
-            </w:tcMar>
-            <w:vAlign w:val="center"/>
-          </w:tcPr>
+              <w:t xml:space="preserve">1.87</w:t>
+            </w:r>
+          </w:p>
           <w:p>
             <w:pPr>
               <w:keepNext/>
@@ -43216,13 +44741,13 @@
                 <w:sz w:val="17"/>
                 <w:szCs w:val="17"/>
               </w:rPr>
-              <w:t xml:space="preserve">t(14) = 5.72</w:t>
-            </w:r>
-          </w:p>
-        </w:tc>
-        <w:tc>
-          <w:tcPr>
-            <w:tcW w:type="dxa" w:w="760"/>
+              <w:t xml:space="preserve">[0.84, 2.89]</w:t>
+            </w:r>
+          </w:p>
+        </w:tc>
+        <w:tc>
+          <w:tcPr>
+            <w:tcW w:type="dxa" w:w="1000"/>
             <w:tcBorders>
               <w:top w:val="single" w:color="000000" w:sz="4"/>
               <w:left w:val="single" w:color="000000" w:sz="4"/>
@@ -43250,13 +44775,13 @@
                 <w:sz w:val="17"/>
                 <w:szCs w:val="17"/>
               </w:rPr>
-              <w:t xml:space="preserve">&lt; .001</w:t>
-            </w:r>
-          </w:p>
-        </w:tc>
-        <w:tc>
-          <w:tcPr>
-            <w:tcW w:type="dxa" w:w="900"/>
+              <w:t xml:space="preserve">t(14) = 3.92</w:t>
+            </w:r>
+          </w:p>
+        </w:tc>
+        <w:tc>
+          <w:tcPr>
+            <w:tcW w:type="dxa" w:w="650"/>
             <w:tcBorders>
               <w:top w:val="single" w:color="000000" w:sz="4"/>
               <w:left w:val="single" w:color="000000" w:sz="4"/>
@@ -43284,13 +44809,13 @@
                 <w:sz w:val="17"/>
                 <w:szCs w:val="17"/>
               </w:rPr>
-              <w:t xml:space="preserve">d = 1.48</w:t>
-            </w:r>
-          </w:p>
-        </w:tc>
-        <w:tc>
-          <w:tcPr>
-            <w:tcW w:type="dxa" w:w="880"/>
+              <w:t xml:space="preserve">.002</w:t>
+            </w:r>
+          </w:p>
+        </w:tc>
+        <w:tc>
+          <w:tcPr>
+            <w:tcW w:type="dxa" w:w="1180"/>
             <w:tcBorders>
               <w:top w:val="single" w:color="000000" w:sz="4"/>
               <w:left w:val="single" w:color="000000" w:sz="4"/>
@@ -43318,13 +44843,13 @@
                 <w:sz w:val="17"/>
                 <w:szCs w:val="17"/>
               </w:rPr>
-              <w:t xml:space="preserve">Large</w:t>
-            </w:r>
-          </w:p>
-        </w:tc>
-        <w:tc>
-          <w:tcPr>
-            <w:tcW w:type="dxa" w:w="1200"/>
+              <w:t xml:space="preserve">d = 1.01 (Large)</w:t>
+            </w:r>
+          </w:p>
+        </w:tc>
+        <w:tc>
+          <w:tcPr>
+            <w:tcW w:type="dxa" w:w="1080"/>
             <w:tcBorders>
               <w:top w:val="single" w:color="000000" w:sz="4"/>
               <w:left w:val="single" w:color="000000" w:sz="4"/>
@@ -43352,7 +44877,7 @@
                 <w:sz w:val="17"/>
                 <w:szCs w:val="17"/>
               </w:rPr>
-              <w:t xml:space="preserve">Reject Ho; Significant</w:t>
+              <w:t xml:space="preserve">Reject Ho</w:t>
             </w:r>
           </w:p>
         </w:tc>
@@ -43397,7 +44922,7 @@
         </w:tc>
         <w:tc>
           <w:tcPr>
-            <w:tcW w:type="dxa" w:w="860"/>
+            <w:tcW w:type="dxa" w:w="1150"/>
             <w:tcBorders>
               <w:top w:val="single" w:color="000000" w:sz="4"/>
               <w:left w:val="single" w:color="000000" w:sz="4"/>
@@ -43425,13 +44950,13 @@
                 <w:sz w:val="17"/>
                 <w:szCs w:val="17"/>
               </w:rPr>
-              <w:t xml:space="preserve">51.59</w:t>
-            </w:r>
-          </w:p>
-        </w:tc>
-        <w:tc>
-          <w:tcPr>
-            <w:tcW w:type="dxa" w:w="860"/>
+              <w:t xml:space="preserve">51.59 (11.03)</w:t>
+            </w:r>
+          </w:p>
+        </w:tc>
+        <w:tc>
+          <w:tcPr>
+            <w:tcW w:type="dxa" w:w="1150"/>
             <w:tcBorders>
               <w:top w:val="single" w:color="000000" w:sz="4"/>
               <w:left w:val="single" w:color="000000" w:sz="4"/>
@@ -43459,13 +44984,13 @@
                 <w:sz w:val="17"/>
                 <w:szCs w:val="17"/>
               </w:rPr>
-              <w:t xml:space="preserve">70.92</w:t>
-            </w:r>
-          </w:p>
-        </w:tc>
-        <w:tc>
-          <w:tcPr>
-            <w:tcW w:type="dxa" w:w="900"/>
+              <w:t xml:space="preserve">67.08 (17.71)</w:t>
+            </w:r>
+          </w:p>
+        </w:tc>
+        <w:tc>
+          <w:tcPr>
+            <w:tcW w:type="dxa" w:w="1250"/>
             <w:tcBorders>
               <w:top w:val="single" w:color="000000" w:sz="4"/>
               <w:left w:val="single" w:color="000000" w:sz="4"/>
@@ -43493,27 +45018,9 @@
                 <w:sz w:val="17"/>
                 <w:szCs w:val="17"/>
               </w:rPr>
-              <w:t xml:space="preserve">19.33</w:t>
-            </w:r>
-          </w:p>
-        </w:tc>
-        <w:tc>
-          <w:tcPr>
-            <w:tcW w:type="dxa" w:w="1100"/>
-            <w:tcBorders>
-              <w:top w:val="single" w:color="000000" w:sz="4"/>
-              <w:left w:val="single" w:color="000000" w:sz="4"/>
-              <w:bottom w:val="single" w:color="000000" w:sz="4"/>
-              <w:right w:val="single" w:color="000000" w:sz="4"/>
-            </w:tcBorders>
-            <w:tcMar>
-              <w:top w:type="dxa" w:w="40"/>
-              <w:left w:type="dxa" w:w="80"/>
-              <w:bottom w:type="dxa" w:w="40"/>
-              <w:right w:type="dxa" w:w="80"/>
-            </w:tcMar>
-            <w:vAlign w:val="center"/>
-          </w:tcPr>
+              <w:t xml:space="preserve">15.49</w:t>
+            </w:r>
+          </w:p>
           <w:p>
             <w:pPr>
               <w:keepNext w:val="false"/>
@@ -43527,13 +45034,13 @@
                 <w:sz w:val="17"/>
                 <w:szCs w:val="17"/>
               </w:rPr>
-              <w:t xml:space="preserve">t(14) = 7.67</w:t>
-            </w:r>
-          </w:p>
-        </w:tc>
-        <w:tc>
-          <w:tcPr>
-            <w:tcW w:type="dxa" w:w="760"/>
+              <w:t xml:space="preserve">[8.70, 22.27]</w:t>
+            </w:r>
+          </w:p>
+        </w:tc>
+        <w:tc>
+          <w:tcPr>
+            <w:tcW w:type="dxa" w:w="1000"/>
             <w:tcBorders>
               <w:top w:val="single" w:color="000000" w:sz="4"/>
               <w:left w:val="single" w:color="000000" w:sz="4"/>
@@ -43561,13 +45068,13 @@
                 <w:sz w:val="17"/>
                 <w:szCs w:val="17"/>
               </w:rPr>
-              <w:t xml:space="preserve">&lt; .001</w:t>
-            </w:r>
-          </w:p>
-        </w:tc>
-        <w:tc>
-          <w:tcPr>
-            <w:tcW w:type="dxa" w:w="900"/>
+              <w:t xml:space="preserve">t(14) = 4.90</w:t>
+            </w:r>
+          </w:p>
+        </w:tc>
+        <w:tc>
+          <w:tcPr>
+            <w:tcW w:type="dxa" w:w="650"/>
             <w:tcBorders>
               <w:top w:val="single" w:color="000000" w:sz="4"/>
               <w:left w:val="single" w:color="000000" w:sz="4"/>
@@ -43595,13 +45102,13 @@
                 <w:sz w:val="17"/>
                 <w:szCs w:val="17"/>
               </w:rPr>
-              <w:t xml:space="preserve">d = 1.98</w:t>
-            </w:r>
-          </w:p>
-        </w:tc>
-        <w:tc>
-          <w:tcPr>
-            <w:tcW w:type="dxa" w:w="880"/>
+              <w:t xml:space="preserve">&lt; .001</w:t>
+            </w:r>
+          </w:p>
+        </w:tc>
+        <w:tc>
+          <w:tcPr>
+            <w:tcW w:type="dxa" w:w="1180"/>
             <w:tcBorders>
               <w:top w:val="single" w:color="000000" w:sz="4"/>
               <w:left w:val="single" w:color="000000" w:sz="4"/>
@@ -43629,13 +45136,13 @@
                 <w:sz w:val="17"/>
                 <w:szCs w:val="17"/>
               </w:rPr>
-              <w:t xml:space="preserve">Large</w:t>
-            </w:r>
-          </w:p>
-        </w:tc>
-        <w:tc>
-          <w:tcPr>
-            <w:tcW w:type="dxa" w:w="1200"/>
+              <w:t xml:space="preserve">d = 1.26 (Large)</w:t>
+            </w:r>
+          </w:p>
+        </w:tc>
+        <w:tc>
+          <w:tcPr>
+            <w:tcW w:type="dxa" w:w="1080"/>
             <w:tcBorders>
               <w:top w:val="single" w:color="000000" w:sz="4"/>
               <w:left w:val="single" w:color="000000" w:sz="4"/>
@@ -43663,7 +45170,7 @@
                 <w:sz w:val="17"/>
                 <w:szCs w:val="17"/>
               </w:rPr>
-              <w:t xml:space="preserve">Reject Ho; Significant</w:t>
+              <w:t xml:space="preserve">Reject Ho</w:t>
             </w:r>
           </w:p>
         </w:tc>
@@ -43682,7 +45189,7 @@
         <w:t xml:space="preserve">Note. </w:t>
       </w:r>
       <w:r>
-        <w:t xml:space="preserve">Significance level = .05; Ho = There is no significant difference between the pre-test and post-test reading proficiency levels of the learners. Effect size: d = 0.20 small, 0.50 medium, 0.80 large (Cohen, 1988).</w:t>
+        <w:t xml:space="preserve">Significance level = .05; Ho = There is no significant difference between the pre-test and post-test reading proficiency levels of the learners. CI = confidence interval. Effect size: d = 0.20 small, 0.50 medium, 0.80 large (Cohen, 1988).</w:t>
       </w:r>
     </w:p>
     <w:sectPr>

</xml_diff>